<commit_message>
Update ManualProceso_MesaPass_V2.0 (1) (1).docx
</commit_message>
<xml_diff>
--- a/MANUAL/ManualProceso_MesaPass_V2.0 (1) (1).docx
+++ b/MANUAL/ManualProceso_MesaPass_V2.0 (1) (1).docx
@@ -703,7 +703,7 @@
           <w:rPr>
             <w:webHidden/>
           </w:rPr>
-          <w:t>4</w:t>
+          <w:t>3</w:t>
         </w:r>
         <w:r>
           <w:rPr>
@@ -776,7 +776,7 @@
           <w:rPr>
             <w:webHidden/>
           </w:rPr>
-          <w:t>4</w:t>
+          <w:t>3</w:t>
         </w:r>
         <w:r>
           <w:rPr>
@@ -849,7 +849,7 @@
           <w:rPr>
             <w:webHidden/>
           </w:rPr>
-          <w:t>4</w:t>
+          <w:t>3</w:t>
         </w:r>
         <w:r>
           <w:rPr>
@@ -922,7 +922,7 @@
           <w:rPr>
             <w:webHidden/>
           </w:rPr>
-          <w:t>4</w:t>
+          <w:t>3</w:t>
         </w:r>
         <w:r>
           <w:rPr>
@@ -984,18 +984,15 @@
           <w:rPr>
             <w:webHidden/>
           </w:rPr>
-        </w:r>
-        <w:r>
-          <w:rPr>
-            <w:webHidden/>
-          </w:rPr>
           <w:fldChar w:fldCharType="separate"/>
         </w:r>
         <w:r>
           <w:rPr>
+            <w:b w:val="0"/>
+            <w:bCs/>
             <w:webHidden/>
           </w:rPr>
-          <w:t>5</w:t>
+          <w:t>¡Error! Marcador no definido.</w:t>
         </w:r>
         <w:r>
           <w:rPr>
@@ -1293,7 +1290,7 @@
           <w:rPr>
             <w:webHidden/>
           </w:rPr>
-          <w:t>6</w:t>
+          <w:t>8</w:t>
         </w:r>
         <w:r>
           <w:rPr>
@@ -1366,7 +1363,7 @@
           <w:rPr>
             <w:webHidden/>
           </w:rPr>
-          <w:t>7</w:t>
+          <w:t>9</w:t>
         </w:r>
         <w:r>
           <w:rPr>
@@ -1439,7 +1436,7 @@
           <w:rPr>
             <w:webHidden/>
           </w:rPr>
-          <w:t>7</w:t>
+          <w:t>10</w:t>
         </w:r>
         <w:r>
           <w:rPr>
@@ -1501,18 +1498,15 @@
           <w:rPr>
             <w:webHidden/>
           </w:rPr>
-        </w:r>
-        <w:r>
-          <w:rPr>
-            <w:webHidden/>
-          </w:rPr>
           <w:fldChar w:fldCharType="separate"/>
         </w:r>
         <w:r>
           <w:rPr>
+            <w:b w:val="0"/>
+            <w:bCs/>
             <w:webHidden/>
           </w:rPr>
-          <w:t>7</w:t>
+          <w:t>¡Error! Marcador no definido.</w:t>
         </w:r>
         <w:r>
           <w:rPr>
@@ -3198,6 +3192,13 @@
         <w:t xml:space="preserve"> </w:t>
       </w:r>
     </w:p>
+    <w:p>
+      <w:pPr>
+        <w:rPr>
+          <w:lang w:val="es-EC"/>
+        </w:rPr>
+      </w:pPr>
+    </w:p>
     <w:tbl>
       <w:tblPr>
         <w:tblStyle w:val="Tablaconcuadrcula"/>
@@ -3205,14 +3206,14 @@
         <w:tblLook w:val="04A0" w:firstRow="1" w:lastRow="0" w:firstColumn="1" w:lastColumn="0" w:noHBand="0" w:noVBand="1"/>
       </w:tblPr>
       <w:tblGrid>
-        <w:gridCol w:w="570"/>
-        <w:gridCol w:w="1615"/>
-        <w:gridCol w:w="1947"/>
-        <w:gridCol w:w="1413"/>
-        <w:gridCol w:w="2574"/>
-        <w:gridCol w:w="1477"/>
-        <w:gridCol w:w="1977"/>
-        <w:gridCol w:w="1853"/>
+        <w:gridCol w:w="538"/>
+        <w:gridCol w:w="1723"/>
+        <w:gridCol w:w="2480"/>
+        <w:gridCol w:w="1552"/>
+        <w:gridCol w:w="2284"/>
+        <w:gridCol w:w="1507"/>
+        <w:gridCol w:w="1523"/>
+        <w:gridCol w:w="1819"/>
       </w:tblGrid>
       <w:tr>
         <w:tc>
@@ -3225,21 +3226,17 @@
               <w:spacing w:after="0" w:line="240" w:lineRule="auto"/>
               <w:jc w:val="center"/>
               <w:rPr>
-                <w:rFonts w:ascii="Times New Roman" w:eastAsia="Times New Roman" w:hAnsi="Times New Roman"/>
+                <w:rFonts w:asciiTheme="minorHAnsi" w:eastAsia="Times New Roman" w:hAnsiTheme="minorHAnsi" w:cstheme="minorHAnsi"/>
                 <w:b/>
                 <w:bCs/>
-                <w:sz w:val="24"/>
-                <w:szCs w:val="24"/>
-                <w:lang w:val="es-EC" w:eastAsia="es-EC"/>
-              </w:rPr>
-            </w:pPr>
-            <w:r>
-              <w:rPr>
-                <w:rFonts w:ascii="Times New Roman" w:eastAsia="Times New Roman" w:hAnsi="Times New Roman"/>
+                <w:lang w:val="es-EC" w:eastAsia="es-EC"/>
+              </w:rPr>
+            </w:pPr>
+            <w:r>
+              <w:rPr>
+                <w:rFonts w:asciiTheme="minorHAnsi" w:eastAsia="Times New Roman" w:hAnsiTheme="minorHAnsi" w:cstheme="minorHAnsi"/>
                 <w:b/>
                 <w:bCs/>
-                <w:sz w:val="24"/>
-                <w:szCs w:val="24"/>
                 <w:lang w:val="es-EC" w:eastAsia="es-EC"/>
               </w:rPr>
               <w:t>No.</w:t>
@@ -3256,21 +3253,17 @@
               <w:spacing w:after="0" w:line="240" w:lineRule="auto"/>
               <w:jc w:val="center"/>
               <w:rPr>
-                <w:rFonts w:ascii="Times New Roman" w:eastAsia="Times New Roman" w:hAnsi="Times New Roman"/>
+                <w:rFonts w:asciiTheme="minorHAnsi" w:eastAsia="Times New Roman" w:hAnsiTheme="minorHAnsi" w:cstheme="minorHAnsi"/>
                 <w:b/>
                 <w:bCs/>
-                <w:sz w:val="24"/>
-                <w:szCs w:val="24"/>
-                <w:lang w:val="es-EC" w:eastAsia="es-EC"/>
-              </w:rPr>
-            </w:pPr>
-            <w:r>
-              <w:rPr>
-                <w:rFonts w:ascii="Times New Roman" w:eastAsia="Times New Roman" w:hAnsi="Times New Roman"/>
+                <w:lang w:val="es-EC" w:eastAsia="es-EC"/>
+              </w:rPr>
+            </w:pPr>
+            <w:r>
+              <w:rPr>
+                <w:rFonts w:asciiTheme="minorHAnsi" w:eastAsia="Times New Roman" w:hAnsiTheme="minorHAnsi" w:cstheme="minorHAnsi"/>
                 <w:b/>
                 <w:bCs/>
-                <w:sz w:val="24"/>
-                <w:szCs w:val="24"/>
                 <w:lang w:val="es-EC" w:eastAsia="es-EC"/>
               </w:rPr>
               <w:t>ACTIVIDAD</w:t>
@@ -3287,21 +3280,17 @@
               <w:spacing w:after="0" w:line="240" w:lineRule="auto"/>
               <w:jc w:val="center"/>
               <w:rPr>
-                <w:rFonts w:ascii="Times New Roman" w:eastAsia="Times New Roman" w:hAnsi="Times New Roman"/>
+                <w:rFonts w:asciiTheme="minorHAnsi" w:eastAsia="Times New Roman" w:hAnsiTheme="minorHAnsi" w:cstheme="minorHAnsi"/>
                 <w:b/>
                 <w:bCs/>
-                <w:sz w:val="24"/>
-                <w:szCs w:val="24"/>
-                <w:lang w:val="es-EC" w:eastAsia="es-EC"/>
-              </w:rPr>
-            </w:pPr>
-            <w:r>
-              <w:rPr>
-                <w:rFonts w:ascii="Times New Roman" w:eastAsia="Times New Roman" w:hAnsi="Times New Roman"/>
+                <w:lang w:val="es-EC" w:eastAsia="es-EC"/>
+              </w:rPr>
+            </w:pPr>
+            <w:r>
+              <w:rPr>
+                <w:rFonts w:asciiTheme="minorHAnsi" w:eastAsia="Times New Roman" w:hAnsiTheme="minorHAnsi" w:cstheme="minorHAnsi"/>
                 <w:b/>
                 <w:bCs/>
-                <w:sz w:val="24"/>
-                <w:szCs w:val="24"/>
                 <w:lang w:val="es-EC" w:eastAsia="es-EC"/>
               </w:rPr>
               <w:t>DESCRIPCIÓN DE LA ACTIVIDAD</w:t>
@@ -3318,21 +3307,17 @@
               <w:spacing w:after="0" w:line="240" w:lineRule="auto"/>
               <w:jc w:val="center"/>
               <w:rPr>
-                <w:rFonts w:ascii="Times New Roman" w:eastAsia="Times New Roman" w:hAnsi="Times New Roman"/>
+                <w:rFonts w:asciiTheme="minorHAnsi" w:eastAsia="Times New Roman" w:hAnsiTheme="minorHAnsi" w:cstheme="minorHAnsi"/>
                 <w:b/>
                 <w:bCs/>
-                <w:sz w:val="24"/>
-                <w:szCs w:val="24"/>
-                <w:lang w:val="es-EC" w:eastAsia="es-EC"/>
-              </w:rPr>
-            </w:pPr>
-            <w:r>
-              <w:rPr>
-                <w:rFonts w:ascii="Times New Roman" w:eastAsia="Times New Roman" w:hAnsi="Times New Roman"/>
+                <w:lang w:val="es-EC" w:eastAsia="es-EC"/>
+              </w:rPr>
+            </w:pPr>
+            <w:r>
+              <w:rPr>
+                <w:rFonts w:asciiTheme="minorHAnsi" w:eastAsia="Times New Roman" w:hAnsiTheme="minorHAnsi" w:cstheme="minorHAnsi"/>
                 <w:b/>
                 <w:bCs/>
-                <w:sz w:val="24"/>
-                <w:szCs w:val="24"/>
                 <w:lang w:val="es-EC" w:eastAsia="es-EC"/>
               </w:rPr>
               <w:t>INPUT</w:t>
@@ -3349,21 +3334,17 @@
               <w:spacing w:after="0" w:line="240" w:lineRule="auto"/>
               <w:jc w:val="center"/>
               <w:rPr>
-                <w:rFonts w:ascii="Times New Roman" w:eastAsia="Times New Roman" w:hAnsi="Times New Roman"/>
+                <w:rFonts w:asciiTheme="minorHAnsi" w:eastAsia="Times New Roman" w:hAnsiTheme="minorHAnsi" w:cstheme="minorHAnsi"/>
                 <w:b/>
                 <w:bCs/>
-                <w:sz w:val="24"/>
-                <w:szCs w:val="24"/>
-                <w:lang w:val="es-EC" w:eastAsia="es-EC"/>
-              </w:rPr>
-            </w:pPr>
-            <w:r>
-              <w:rPr>
-                <w:rFonts w:ascii="Times New Roman" w:eastAsia="Times New Roman" w:hAnsi="Times New Roman"/>
+                <w:lang w:val="es-EC" w:eastAsia="es-EC"/>
+              </w:rPr>
+            </w:pPr>
+            <w:r>
+              <w:rPr>
+                <w:rFonts w:asciiTheme="minorHAnsi" w:eastAsia="Times New Roman" w:hAnsiTheme="minorHAnsi" w:cstheme="minorHAnsi"/>
                 <w:b/>
                 <w:bCs/>
-                <w:sz w:val="24"/>
-                <w:szCs w:val="24"/>
                 <w:lang w:val="es-EC" w:eastAsia="es-EC"/>
               </w:rPr>
               <w:t>TRANSFORMACIÓN</w:t>
@@ -3380,21 +3361,17 @@
               <w:spacing w:after="0" w:line="240" w:lineRule="auto"/>
               <w:jc w:val="center"/>
               <w:rPr>
-                <w:rFonts w:ascii="Times New Roman" w:eastAsia="Times New Roman" w:hAnsi="Times New Roman"/>
+                <w:rFonts w:asciiTheme="minorHAnsi" w:eastAsia="Times New Roman" w:hAnsiTheme="minorHAnsi" w:cstheme="minorHAnsi"/>
                 <w:b/>
                 <w:bCs/>
-                <w:sz w:val="24"/>
-                <w:szCs w:val="24"/>
-                <w:lang w:val="es-EC" w:eastAsia="es-EC"/>
-              </w:rPr>
-            </w:pPr>
-            <w:r>
-              <w:rPr>
-                <w:rFonts w:ascii="Times New Roman" w:eastAsia="Times New Roman" w:hAnsi="Times New Roman"/>
+                <w:lang w:val="es-EC" w:eastAsia="es-EC"/>
+              </w:rPr>
+            </w:pPr>
+            <w:r>
+              <w:rPr>
+                <w:rFonts w:asciiTheme="minorHAnsi" w:eastAsia="Times New Roman" w:hAnsiTheme="minorHAnsi" w:cstheme="minorHAnsi"/>
                 <w:b/>
                 <w:bCs/>
-                <w:sz w:val="24"/>
-                <w:szCs w:val="24"/>
                 <w:lang w:val="es-EC" w:eastAsia="es-EC"/>
               </w:rPr>
               <w:t>OUTPUT</w:t>
@@ -3411,21 +3388,17 @@
               <w:spacing w:after="0" w:line="240" w:lineRule="auto"/>
               <w:jc w:val="center"/>
               <w:rPr>
-                <w:rFonts w:ascii="Times New Roman" w:eastAsia="Times New Roman" w:hAnsi="Times New Roman"/>
+                <w:rFonts w:asciiTheme="minorHAnsi" w:eastAsia="Times New Roman" w:hAnsiTheme="minorHAnsi" w:cstheme="minorHAnsi"/>
                 <w:b/>
                 <w:bCs/>
-                <w:sz w:val="24"/>
-                <w:szCs w:val="24"/>
-                <w:lang w:val="es-EC" w:eastAsia="es-EC"/>
-              </w:rPr>
-            </w:pPr>
-            <w:r>
-              <w:rPr>
-                <w:rFonts w:ascii="Times New Roman" w:eastAsia="Times New Roman" w:hAnsi="Times New Roman"/>
+                <w:lang w:val="es-EC" w:eastAsia="es-EC"/>
+              </w:rPr>
+            </w:pPr>
+            <w:r>
+              <w:rPr>
+                <w:rFonts w:asciiTheme="minorHAnsi" w:eastAsia="Times New Roman" w:hAnsiTheme="minorHAnsi" w:cstheme="minorHAnsi"/>
                 <w:b/>
                 <w:bCs/>
-                <w:sz w:val="24"/>
-                <w:szCs w:val="24"/>
                 <w:lang w:val="es-EC" w:eastAsia="es-EC"/>
               </w:rPr>
               <w:t>RESPONSABLE</w:t>
@@ -3442,21 +3415,17 @@
               <w:spacing w:after="0" w:line="240" w:lineRule="auto"/>
               <w:jc w:val="center"/>
               <w:rPr>
-                <w:rFonts w:ascii="Times New Roman" w:eastAsia="Times New Roman" w:hAnsi="Times New Roman"/>
+                <w:rFonts w:asciiTheme="minorHAnsi" w:eastAsia="Times New Roman" w:hAnsiTheme="minorHAnsi" w:cstheme="minorHAnsi"/>
                 <w:b/>
                 <w:bCs/>
-                <w:sz w:val="24"/>
-                <w:szCs w:val="24"/>
-                <w:lang w:val="es-EC" w:eastAsia="es-EC"/>
-              </w:rPr>
-            </w:pPr>
-            <w:r>
-              <w:rPr>
-                <w:rFonts w:ascii="Times New Roman" w:eastAsia="Times New Roman" w:hAnsi="Times New Roman"/>
+                <w:lang w:val="es-EC" w:eastAsia="es-EC"/>
+              </w:rPr>
+            </w:pPr>
+            <w:r>
+              <w:rPr>
+                <w:rFonts w:asciiTheme="minorHAnsi" w:eastAsia="Times New Roman" w:hAnsiTheme="minorHAnsi" w:cstheme="minorHAnsi"/>
                 <w:b/>
                 <w:bCs/>
-                <w:sz w:val="24"/>
-                <w:szCs w:val="24"/>
                 <w:lang w:val="es-EC" w:eastAsia="es-EC"/>
               </w:rPr>
               <w:t>DOCUMENTO DE REFERENCIA / SISTEMA</w:t>
@@ -3475,17 +3444,13 @@
               <w:spacing w:after="0" w:line="240" w:lineRule="auto"/>
               <w:jc w:val="center"/>
               <w:rPr>
-                <w:rFonts w:ascii="Times New Roman" w:eastAsia="Times New Roman" w:hAnsi="Times New Roman"/>
-                <w:sz w:val="24"/>
-                <w:szCs w:val="24"/>
-                <w:lang w:val="es-EC" w:eastAsia="es-EC"/>
-              </w:rPr>
-            </w:pPr>
-            <w:r>
-              <w:rPr>
-                <w:rFonts w:ascii="Times New Roman" w:eastAsia="Times New Roman" w:hAnsi="Times New Roman"/>
-                <w:sz w:val="24"/>
-                <w:szCs w:val="24"/>
+                <w:rFonts w:asciiTheme="minorHAnsi" w:eastAsia="Times New Roman" w:hAnsiTheme="minorHAnsi" w:cstheme="minorHAnsi"/>
+                <w:lang w:val="es-EC" w:eastAsia="es-EC"/>
+              </w:rPr>
+            </w:pPr>
+            <w:r>
+              <w:rPr>
+                <w:rFonts w:asciiTheme="minorHAnsi" w:eastAsia="Times New Roman" w:hAnsiTheme="minorHAnsi" w:cstheme="minorHAnsi"/>
                 <w:lang w:val="es-EC" w:eastAsia="es-EC"/>
               </w:rPr>
               <w:t>1</w:t>
@@ -3502,17 +3467,13 @@
               <w:spacing w:after="0" w:line="240" w:lineRule="auto"/>
               <w:jc w:val="center"/>
               <w:rPr>
-                <w:rFonts w:ascii="Times New Roman" w:eastAsia="Times New Roman" w:hAnsi="Times New Roman"/>
-                <w:sz w:val="24"/>
-                <w:szCs w:val="24"/>
-                <w:lang w:val="es-EC" w:eastAsia="es-EC"/>
-              </w:rPr>
-            </w:pPr>
-            <w:r>
-              <w:rPr>
-                <w:rFonts w:ascii="Times New Roman" w:eastAsia="Times New Roman" w:hAnsi="Times New Roman"/>
-                <w:sz w:val="24"/>
-                <w:szCs w:val="24"/>
+                <w:rFonts w:asciiTheme="minorHAnsi" w:eastAsia="Times New Roman" w:hAnsiTheme="minorHAnsi" w:cstheme="minorHAnsi"/>
+                <w:lang w:val="es-EC" w:eastAsia="es-EC"/>
+              </w:rPr>
+            </w:pPr>
+            <w:r>
+              <w:rPr>
+                <w:rFonts w:asciiTheme="minorHAnsi" w:eastAsia="Times New Roman" w:hAnsiTheme="minorHAnsi" w:cstheme="minorHAnsi"/>
                 <w:lang w:val="es-EC" w:eastAsia="es-EC"/>
               </w:rPr>
               <w:t>Definir acuerdos con restaurantes</w:t>
@@ -3529,17 +3490,13 @@
               <w:spacing w:after="0" w:line="240" w:lineRule="auto"/>
               <w:jc w:val="center"/>
               <w:rPr>
-                <w:rFonts w:ascii="Times New Roman" w:eastAsia="Times New Roman" w:hAnsi="Times New Roman"/>
-                <w:sz w:val="24"/>
-                <w:szCs w:val="24"/>
-                <w:lang w:val="es-EC" w:eastAsia="es-EC"/>
-              </w:rPr>
-            </w:pPr>
-            <w:r>
-              <w:rPr>
-                <w:rFonts w:ascii="Times New Roman" w:eastAsia="Times New Roman" w:hAnsi="Times New Roman"/>
-                <w:sz w:val="24"/>
-                <w:szCs w:val="24"/>
+                <w:rFonts w:asciiTheme="minorHAnsi" w:eastAsia="Times New Roman" w:hAnsiTheme="minorHAnsi" w:cstheme="minorHAnsi"/>
+                <w:lang w:val="es-EC" w:eastAsia="es-EC"/>
+              </w:rPr>
+            </w:pPr>
+            <w:r>
+              <w:rPr>
+                <w:rFonts w:asciiTheme="minorHAnsi" w:eastAsia="Times New Roman" w:hAnsiTheme="minorHAnsi" w:cstheme="minorHAnsi"/>
                 <w:lang w:val="es-EC" w:eastAsia="es-EC"/>
               </w:rPr>
               <w:t>La empresa establece acuerdos con restaurantes para la provisión del servicio de alimentación</w:t>
@@ -3556,17 +3513,13 @@
               <w:spacing w:after="0" w:line="240" w:lineRule="auto"/>
               <w:jc w:val="center"/>
               <w:rPr>
-                <w:rFonts w:ascii="Times New Roman" w:eastAsia="Times New Roman" w:hAnsi="Times New Roman"/>
-                <w:sz w:val="24"/>
-                <w:szCs w:val="24"/>
-                <w:lang w:val="es-EC" w:eastAsia="es-EC"/>
-              </w:rPr>
-            </w:pPr>
-            <w:r>
-              <w:rPr>
-                <w:rFonts w:ascii="Times New Roman" w:eastAsia="Times New Roman" w:hAnsi="Times New Roman"/>
-                <w:sz w:val="24"/>
-                <w:szCs w:val="24"/>
+                <w:rFonts w:asciiTheme="minorHAnsi" w:eastAsia="Times New Roman" w:hAnsiTheme="minorHAnsi" w:cstheme="minorHAnsi"/>
+                <w:lang w:val="es-EC" w:eastAsia="es-EC"/>
+              </w:rPr>
+            </w:pPr>
+            <w:r>
+              <w:rPr>
+                <w:rFonts w:asciiTheme="minorHAnsi" w:eastAsia="Times New Roman" w:hAnsiTheme="minorHAnsi" w:cstheme="minorHAnsi"/>
                 <w:lang w:val="es-EC" w:eastAsia="es-EC"/>
               </w:rPr>
               <w:t>Información de restaurantes</w:t>
@@ -3583,17 +3536,13 @@
               <w:spacing w:after="0" w:line="240" w:lineRule="auto"/>
               <w:jc w:val="center"/>
               <w:rPr>
-                <w:rFonts w:ascii="Times New Roman" w:eastAsia="Times New Roman" w:hAnsi="Times New Roman"/>
-                <w:sz w:val="24"/>
-                <w:szCs w:val="24"/>
-                <w:lang w:val="es-EC" w:eastAsia="es-EC"/>
-              </w:rPr>
-            </w:pPr>
-            <w:r>
-              <w:rPr>
-                <w:rFonts w:ascii="Times New Roman" w:eastAsia="Times New Roman" w:hAnsi="Times New Roman"/>
-                <w:sz w:val="24"/>
-                <w:szCs w:val="24"/>
+                <w:rFonts w:asciiTheme="minorHAnsi" w:eastAsia="Times New Roman" w:hAnsiTheme="minorHAnsi" w:cstheme="minorHAnsi"/>
+                <w:lang w:val="es-EC" w:eastAsia="es-EC"/>
+              </w:rPr>
+            </w:pPr>
+            <w:r>
+              <w:rPr>
+                <w:rFonts w:asciiTheme="minorHAnsi" w:eastAsia="Times New Roman" w:hAnsiTheme="minorHAnsi" w:cstheme="minorHAnsi"/>
                 <w:lang w:val="es-EC" w:eastAsia="es-EC"/>
               </w:rPr>
               <w:t>Negociación y definición de condiciones</w:t>
@@ -3610,17 +3559,13 @@
               <w:spacing w:after="0" w:line="240" w:lineRule="auto"/>
               <w:jc w:val="center"/>
               <w:rPr>
-                <w:rFonts w:ascii="Times New Roman" w:eastAsia="Times New Roman" w:hAnsi="Times New Roman"/>
-                <w:sz w:val="24"/>
-                <w:szCs w:val="24"/>
-                <w:lang w:val="es-EC" w:eastAsia="es-EC"/>
-              </w:rPr>
-            </w:pPr>
-            <w:r>
-              <w:rPr>
-                <w:rFonts w:ascii="Times New Roman" w:eastAsia="Times New Roman" w:hAnsi="Times New Roman"/>
-                <w:sz w:val="24"/>
-                <w:szCs w:val="24"/>
+                <w:rFonts w:asciiTheme="minorHAnsi" w:eastAsia="Times New Roman" w:hAnsiTheme="minorHAnsi" w:cstheme="minorHAnsi"/>
+                <w:lang w:val="es-EC" w:eastAsia="es-EC"/>
+              </w:rPr>
+            </w:pPr>
+            <w:r>
+              <w:rPr>
+                <w:rFonts w:asciiTheme="minorHAnsi" w:eastAsia="Times New Roman" w:hAnsiTheme="minorHAnsi" w:cstheme="minorHAnsi"/>
                 <w:lang w:val="es-EC" w:eastAsia="es-EC"/>
               </w:rPr>
               <w:t>Convenios establecidos</w:t>
@@ -3637,17 +3582,13 @@
               <w:spacing w:after="0" w:line="240" w:lineRule="auto"/>
               <w:jc w:val="center"/>
               <w:rPr>
-                <w:rFonts w:ascii="Times New Roman" w:eastAsia="Times New Roman" w:hAnsi="Times New Roman"/>
-                <w:sz w:val="24"/>
-                <w:szCs w:val="24"/>
-                <w:lang w:val="es-EC" w:eastAsia="es-EC"/>
-              </w:rPr>
-            </w:pPr>
-            <w:r>
-              <w:rPr>
-                <w:rFonts w:ascii="Times New Roman" w:eastAsia="Times New Roman" w:hAnsi="Times New Roman"/>
-                <w:sz w:val="24"/>
-                <w:szCs w:val="24"/>
+                <w:rFonts w:asciiTheme="minorHAnsi" w:eastAsia="Times New Roman" w:hAnsiTheme="minorHAnsi" w:cstheme="minorHAnsi"/>
+                <w:lang w:val="es-EC" w:eastAsia="es-EC"/>
+              </w:rPr>
+            </w:pPr>
+            <w:r>
+              <w:rPr>
+                <w:rFonts w:asciiTheme="minorHAnsi" w:eastAsia="Times New Roman" w:hAnsiTheme="minorHAnsi" w:cstheme="minorHAnsi"/>
                 <w:lang w:val="es-EC" w:eastAsia="es-EC"/>
               </w:rPr>
               <w:t>Empresa</w:t>
@@ -3664,17 +3605,13 @@
               <w:spacing w:after="0" w:line="240" w:lineRule="auto"/>
               <w:jc w:val="center"/>
               <w:rPr>
-                <w:rFonts w:ascii="Times New Roman" w:eastAsia="Times New Roman" w:hAnsi="Times New Roman"/>
-                <w:sz w:val="24"/>
-                <w:szCs w:val="24"/>
-                <w:lang w:val="es-EC" w:eastAsia="es-EC"/>
-              </w:rPr>
-            </w:pPr>
-            <w:r>
-              <w:rPr>
-                <w:rFonts w:ascii="Times New Roman" w:eastAsia="Times New Roman" w:hAnsi="Times New Roman"/>
-                <w:sz w:val="24"/>
-                <w:szCs w:val="24"/>
+                <w:rFonts w:asciiTheme="minorHAnsi" w:eastAsia="Times New Roman" w:hAnsiTheme="minorHAnsi" w:cstheme="minorHAnsi"/>
+                <w:lang w:val="es-EC" w:eastAsia="es-EC"/>
+              </w:rPr>
+            </w:pPr>
+            <w:r>
+              <w:rPr>
+                <w:rFonts w:asciiTheme="minorHAnsi" w:eastAsia="Times New Roman" w:hAnsiTheme="minorHAnsi" w:cstheme="minorHAnsi"/>
                 <w:lang w:val="es-EC" w:eastAsia="es-EC"/>
               </w:rPr>
               <w:t>Convenio</w:t>
@@ -3693,17 +3630,13 @@
               <w:spacing w:after="0" w:line="240" w:lineRule="auto"/>
               <w:jc w:val="center"/>
               <w:rPr>
-                <w:rFonts w:ascii="Times New Roman" w:eastAsia="Times New Roman" w:hAnsi="Times New Roman"/>
-                <w:sz w:val="24"/>
-                <w:szCs w:val="24"/>
-                <w:lang w:val="es-EC" w:eastAsia="es-EC"/>
-              </w:rPr>
-            </w:pPr>
-            <w:r>
-              <w:rPr>
-                <w:rFonts w:ascii="Times New Roman" w:eastAsia="Times New Roman" w:hAnsi="Times New Roman"/>
-                <w:sz w:val="24"/>
-                <w:szCs w:val="24"/>
+                <w:rFonts w:asciiTheme="minorHAnsi" w:eastAsia="Times New Roman" w:hAnsiTheme="minorHAnsi" w:cstheme="minorHAnsi"/>
+                <w:lang w:val="es-EC" w:eastAsia="es-EC"/>
+              </w:rPr>
+            </w:pPr>
+            <w:r>
+              <w:rPr>
+                <w:rFonts w:asciiTheme="minorHAnsi" w:eastAsia="Times New Roman" w:hAnsiTheme="minorHAnsi" w:cstheme="minorHAnsi"/>
                 <w:lang w:val="es-EC" w:eastAsia="es-EC"/>
               </w:rPr>
               <w:t>2</w:t>
@@ -3720,17 +3653,13 @@
               <w:spacing w:after="0" w:line="240" w:lineRule="auto"/>
               <w:jc w:val="center"/>
               <w:rPr>
-                <w:rFonts w:ascii="Times New Roman" w:eastAsia="Times New Roman" w:hAnsi="Times New Roman"/>
-                <w:sz w:val="24"/>
-                <w:szCs w:val="24"/>
-                <w:lang w:val="es-EC" w:eastAsia="es-EC"/>
-              </w:rPr>
-            </w:pPr>
-            <w:r>
-              <w:rPr>
-                <w:rFonts w:ascii="Times New Roman" w:eastAsia="Times New Roman" w:hAnsi="Times New Roman"/>
-                <w:sz w:val="24"/>
-                <w:szCs w:val="24"/>
+                <w:rFonts w:asciiTheme="minorHAnsi" w:eastAsia="Times New Roman" w:hAnsiTheme="minorHAnsi" w:cstheme="minorHAnsi"/>
+                <w:lang w:val="es-EC" w:eastAsia="es-EC"/>
+              </w:rPr>
+            </w:pPr>
+            <w:r>
+              <w:rPr>
+                <w:rFonts w:asciiTheme="minorHAnsi" w:eastAsia="Times New Roman" w:hAnsiTheme="minorHAnsi" w:cstheme="minorHAnsi"/>
                 <w:lang w:val="es-EC" w:eastAsia="es-EC"/>
               </w:rPr>
               <w:t>Registrar empleados beneficiarios</w:t>
@@ -3747,17 +3676,13 @@
               <w:spacing w:after="0" w:line="240" w:lineRule="auto"/>
               <w:jc w:val="center"/>
               <w:rPr>
-                <w:rFonts w:ascii="Times New Roman" w:eastAsia="Times New Roman" w:hAnsi="Times New Roman"/>
-                <w:sz w:val="24"/>
-                <w:szCs w:val="24"/>
-                <w:lang w:val="es-EC" w:eastAsia="es-EC"/>
-              </w:rPr>
-            </w:pPr>
-            <w:r>
-              <w:rPr>
-                <w:rFonts w:ascii="Times New Roman" w:eastAsia="Times New Roman" w:hAnsi="Times New Roman"/>
-                <w:sz w:val="24"/>
-                <w:szCs w:val="24"/>
+                <w:rFonts w:asciiTheme="minorHAnsi" w:eastAsia="Times New Roman" w:hAnsiTheme="minorHAnsi" w:cstheme="minorHAnsi"/>
+                <w:lang w:val="es-EC" w:eastAsia="es-EC"/>
+              </w:rPr>
+            </w:pPr>
+            <w:r>
+              <w:rPr>
+                <w:rFonts w:asciiTheme="minorHAnsi" w:eastAsia="Times New Roman" w:hAnsiTheme="minorHAnsi" w:cstheme="minorHAnsi"/>
                 <w:lang w:val="es-EC" w:eastAsia="es-EC"/>
               </w:rPr>
               <w:t>La empresa registra a los empleados que serán beneficiarios del servicio</w:t>
@@ -3774,17 +3699,13 @@
               <w:spacing w:after="0" w:line="240" w:lineRule="auto"/>
               <w:jc w:val="center"/>
               <w:rPr>
-                <w:rFonts w:ascii="Times New Roman" w:eastAsia="Times New Roman" w:hAnsi="Times New Roman"/>
-                <w:sz w:val="24"/>
-                <w:szCs w:val="24"/>
-                <w:lang w:val="es-EC" w:eastAsia="es-EC"/>
-              </w:rPr>
-            </w:pPr>
-            <w:r>
-              <w:rPr>
-                <w:rFonts w:ascii="Times New Roman" w:eastAsia="Times New Roman" w:hAnsi="Times New Roman"/>
-                <w:sz w:val="24"/>
-                <w:szCs w:val="24"/>
+                <w:rFonts w:asciiTheme="minorHAnsi" w:eastAsia="Times New Roman" w:hAnsiTheme="minorHAnsi" w:cstheme="minorHAnsi"/>
+                <w:lang w:val="es-EC" w:eastAsia="es-EC"/>
+              </w:rPr>
+            </w:pPr>
+            <w:r>
+              <w:rPr>
+                <w:rFonts w:asciiTheme="minorHAnsi" w:eastAsia="Times New Roman" w:hAnsiTheme="minorHAnsi" w:cstheme="minorHAnsi"/>
                 <w:lang w:val="es-EC" w:eastAsia="es-EC"/>
               </w:rPr>
               <w:t>Datos de empleados</w:t>
@@ -3801,17 +3722,13 @@
               <w:spacing w:after="0" w:line="240" w:lineRule="auto"/>
               <w:jc w:val="center"/>
               <w:rPr>
-                <w:rFonts w:ascii="Times New Roman" w:eastAsia="Times New Roman" w:hAnsi="Times New Roman"/>
-                <w:sz w:val="24"/>
-                <w:szCs w:val="24"/>
-                <w:lang w:val="es-EC" w:eastAsia="es-EC"/>
-              </w:rPr>
-            </w:pPr>
-            <w:r>
-              <w:rPr>
-                <w:rFonts w:ascii="Times New Roman" w:eastAsia="Times New Roman" w:hAnsi="Times New Roman"/>
-                <w:sz w:val="24"/>
-                <w:szCs w:val="24"/>
+                <w:rFonts w:asciiTheme="minorHAnsi" w:eastAsia="Times New Roman" w:hAnsiTheme="minorHAnsi" w:cstheme="minorHAnsi"/>
+                <w:lang w:val="es-EC" w:eastAsia="es-EC"/>
+              </w:rPr>
+            </w:pPr>
+            <w:r>
+              <w:rPr>
+                <w:rFonts w:asciiTheme="minorHAnsi" w:eastAsia="Times New Roman" w:hAnsiTheme="minorHAnsi" w:cstheme="minorHAnsi"/>
                 <w:lang w:val="es-EC" w:eastAsia="es-EC"/>
               </w:rPr>
               <w:t>Registro de beneficiarios</w:t>
@@ -3828,17 +3745,13 @@
               <w:spacing w:after="0" w:line="240" w:lineRule="auto"/>
               <w:jc w:val="center"/>
               <w:rPr>
-                <w:rFonts w:ascii="Times New Roman" w:eastAsia="Times New Roman" w:hAnsi="Times New Roman"/>
-                <w:sz w:val="24"/>
-                <w:szCs w:val="24"/>
-                <w:lang w:val="es-EC" w:eastAsia="es-EC"/>
-              </w:rPr>
-            </w:pPr>
-            <w:r>
-              <w:rPr>
-                <w:rFonts w:ascii="Times New Roman" w:eastAsia="Times New Roman" w:hAnsi="Times New Roman"/>
-                <w:sz w:val="24"/>
-                <w:szCs w:val="24"/>
+                <w:rFonts w:asciiTheme="minorHAnsi" w:eastAsia="Times New Roman" w:hAnsiTheme="minorHAnsi" w:cstheme="minorHAnsi"/>
+                <w:lang w:val="es-EC" w:eastAsia="es-EC"/>
+              </w:rPr>
+            </w:pPr>
+            <w:r>
+              <w:rPr>
+                <w:rFonts w:asciiTheme="minorHAnsi" w:eastAsia="Times New Roman" w:hAnsiTheme="minorHAnsi" w:cstheme="minorHAnsi"/>
                 <w:lang w:val="es-EC" w:eastAsia="es-EC"/>
               </w:rPr>
               <w:t>Empleados registrados</w:t>
@@ -3855,17 +3768,13 @@
               <w:spacing w:after="0" w:line="240" w:lineRule="auto"/>
               <w:jc w:val="center"/>
               <w:rPr>
-                <w:rFonts w:ascii="Times New Roman" w:eastAsia="Times New Roman" w:hAnsi="Times New Roman"/>
-                <w:sz w:val="24"/>
-                <w:szCs w:val="24"/>
-                <w:lang w:val="es-EC" w:eastAsia="es-EC"/>
-              </w:rPr>
-            </w:pPr>
-            <w:r>
-              <w:rPr>
-                <w:rFonts w:ascii="Times New Roman" w:eastAsia="Times New Roman" w:hAnsi="Times New Roman"/>
-                <w:sz w:val="24"/>
-                <w:szCs w:val="24"/>
+                <w:rFonts w:asciiTheme="minorHAnsi" w:eastAsia="Times New Roman" w:hAnsiTheme="minorHAnsi" w:cstheme="minorHAnsi"/>
+                <w:lang w:val="es-EC" w:eastAsia="es-EC"/>
+              </w:rPr>
+            </w:pPr>
+            <w:r>
+              <w:rPr>
+                <w:rFonts w:asciiTheme="minorHAnsi" w:eastAsia="Times New Roman" w:hAnsiTheme="minorHAnsi" w:cstheme="minorHAnsi"/>
                 <w:lang w:val="es-EC" w:eastAsia="es-EC"/>
               </w:rPr>
               <w:t>Empresa</w:t>
@@ -3882,17 +3791,13 @@
               <w:spacing w:after="0" w:line="240" w:lineRule="auto"/>
               <w:jc w:val="center"/>
               <w:rPr>
-                <w:rFonts w:ascii="Times New Roman" w:eastAsia="Times New Roman" w:hAnsi="Times New Roman"/>
-                <w:sz w:val="24"/>
-                <w:szCs w:val="24"/>
-                <w:lang w:val="es-EC" w:eastAsia="es-EC"/>
-              </w:rPr>
-            </w:pPr>
-            <w:r>
-              <w:rPr>
-                <w:rFonts w:ascii="Times New Roman" w:eastAsia="Times New Roman" w:hAnsi="Times New Roman"/>
-                <w:sz w:val="24"/>
-                <w:szCs w:val="24"/>
+                <w:rFonts w:asciiTheme="minorHAnsi" w:eastAsia="Times New Roman" w:hAnsiTheme="minorHAnsi" w:cstheme="minorHAnsi"/>
+                <w:lang w:val="es-EC" w:eastAsia="es-EC"/>
+              </w:rPr>
+            </w:pPr>
+            <w:r>
+              <w:rPr>
+                <w:rFonts w:asciiTheme="minorHAnsi" w:eastAsia="Times New Roman" w:hAnsiTheme="minorHAnsi" w:cstheme="minorHAnsi"/>
                 <w:lang w:val="es-EC" w:eastAsia="es-EC"/>
               </w:rPr>
               <w:t>Registro de empleados</w:t>
@@ -3911,17 +3816,13 @@
               <w:spacing w:after="0" w:line="240" w:lineRule="auto"/>
               <w:jc w:val="center"/>
               <w:rPr>
-                <w:rFonts w:ascii="Times New Roman" w:eastAsia="Times New Roman" w:hAnsi="Times New Roman"/>
-                <w:sz w:val="24"/>
-                <w:szCs w:val="24"/>
-                <w:lang w:val="es-EC" w:eastAsia="es-EC"/>
-              </w:rPr>
-            </w:pPr>
-            <w:r>
-              <w:rPr>
-                <w:rFonts w:ascii="Times New Roman" w:eastAsia="Times New Roman" w:hAnsi="Times New Roman"/>
-                <w:sz w:val="24"/>
-                <w:szCs w:val="24"/>
+                <w:rFonts w:asciiTheme="minorHAnsi" w:eastAsia="Times New Roman" w:hAnsiTheme="minorHAnsi" w:cstheme="minorHAnsi"/>
+                <w:lang w:val="es-EC" w:eastAsia="es-EC"/>
+              </w:rPr>
+            </w:pPr>
+            <w:r>
+              <w:rPr>
+                <w:rFonts w:asciiTheme="minorHAnsi" w:eastAsia="Times New Roman" w:hAnsiTheme="minorHAnsi" w:cstheme="minorHAnsi"/>
                 <w:lang w:val="es-EC" w:eastAsia="es-EC"/>
               </w:rPr>
               <w:t>3</w:t>
@@ -3938,17 +3839,13 @@
               <w:spacing w:after="0" w:line="240" w:lineRule="auto"/>
               <w:jc w:val="center"/>
               <w:rPr>
-                <w:rFonts w:ascii="Times New Roman" w:eastAsia="Times New Roman" w:hAnsi="Times New Roman"/>
-                <w:sz w:val="24"/>
-                <w:szCs w:val="24"/>
-                <w:lang w:val="es-EC" w:eastAsia="es-EC"/>
-              </w:rPr>
-            </w:pPr>
-            <w:r>
-              <w:rPr>
-                <w:rFonts w:ascii="Times New Roman" w:eastAsia="Times New Roman" w:hAnsi="Times New Roman"/>
-                <w:sz w:val="24"/>
-                <w:szCs w:val="24"/>
+                <w:rFonts w:asciiTheme="minorHAnsi" w:eastAsia="Times New Roman" w:hAnsiTheme="minorHAnsi" w:cstheme="minorHAnsi"/>
+                <w:lang w:val="es-EC" w:eastAsia="es-EC"/>
+              </w:rPr>
+            </w:pPr>
+            <w:r>
+              <w:rPr>
+                <w:rFonts w:asciiTheme="minorHAnsi" w:eastAsia="Times New Roman" w:hAnsiTheme="minorHAnsi" w:cstheme="minorHAnsi"/>
                 <w:lang w:val="es-EC" w:eastAsia="es-EC"/>
               </w:rPr>
               <w:t>Acudir al restaurante</w:t>
@@ -3965,17 +3862,13 @@
               <w:spacing w:after="0" w:line="240" w:lineRule="auto"/>
               <w:jc w:val="center"/>
               <w:rPr>
-                <w:rFonts w:ascii="Times New Roman" w:eastAsia="Times New Roman" w:hAnsi="Times New Roman"/>
-                <w:sz w:val="24"/>
-                <w:szCs w:val="24"/>
-                <w:lang w:val="es-EC" w:eastAsia="es-EC"/>
-              </w:rPr>
-            </w:pPr>
-            <w:r>
-              <w:rPr>
-                <w:rFonts w:ascii="Times New Roman" w:eastAsia="Times New Roman" w:hAnsi="Times New Roman"/>
-                <w:sz w:val="24"/>
-                <w:szCs w:val="24"/>
+                <w:rFonts w:asciiTheme="minorHAnsi" w:eastAsia="Times New Roman" w:hAnsiTheme="minorHAnsi" w:cstheme="minorHAnsi"/>
+                <w:lang w:val="es-EC" w:eastAsia="es-EC"/>
+              </w:rPr>
+            </w:pPr>
+            <w:r>
+              <w:rPr>
+                <w:rFonts w:asciiTheme="minorHAnsi" w:eastAsia="Times New Roman" w:hAnsiTheme="minorHAnsi" w:cstheme="minorHAnsi"/>
                 <w:lang w:val="es-EC" w:eastAsia="es-EC"/>
               </w:rPr>
               <w:t>El empleado se dirige al restaurante afiliado para acceder al servicio</w:t>
@@ -3992,17 +3885,13 @@
               <w:spacing w:after="0" w:line="240" w:lineRule="auto"/>
               <w:jc w:val="center"/>
               <w:rPr>
-                <w:rFonts w:ascii="Times New Roman" w:eastAsia="Times New Roman" w:hAnsi="Times New Roman"/>
-                <w:sz w:val="24"/>
-                <w:szCs w:val="24"/>
-                <w:lang w:val="es-EC" w:eastAsia="es-EC"/>
-              </w:rPr>
-            </w:pPr>
-            <w:r>
-              <w:rPr>
-                <w:rFonts w:ascii="Times New Roman" w:eastAsia="Times New Roman" w:hAnsi="Times New Roman"/>
-                <w:sz w:val="24"/>
-                <w:szCs w:val="24"/>
+                <w:rFonts w:asciiTheme="minorHAnsi" w:eastAsia="Times New Roman" w:hAnsiTheme="minorHAnsi" w:cstheme="minorHAnsi"/>
+                <w:lang w:val="es-EC" w:eastAsia="es-EC"/>
+              </w:rPr>
+            </w:pPr>
+            <w:r>
+              <w:rPr>
+                <w:rFonts w:asciiTheme="minorHAnsi" w:eastAsia="Times New Roman" w:hAnsiTheme="minorHAnsi" w:cstheme="minorHAnsi"/>
                 <w:lang w:val="es-EC" w:eastAsia="es-EC"/>
               </w:rPr>
               <w:t>Necesidad de consumo</w:t>
@@ -4019,17 +3908,13 @@
               <w:spacing w:after="0" w:line="240" w:lineRule="auto"/>
               <w:jc w:val="center"/>
               <w:rPr>
-                <w:rFonts w:ascii="Times New Roman" w:eastAsia="Times New Roman" w:hAnsi="Times New Roman"/>
-                <w:sz w:val="24"/>
-                <w:szCs w:val="24"/>
-                <w:lang w:val="es-EC" w:eastAsia="es-EC"/>
-              </w:rPr>
-            </w:pPr>
-            <w:r>
-              <w:rPr>
-                <w:rFonts w:ascii="Times New Roman" w:eastAsia="Times New Roman" w:hAnsi="Times New Roman"/>
-                <w:sz w:val="24"/>
-                <w:szCs w:val="24"/>
+                <w:rFonts w:asciiTheme="minorHAnsi" w:eastAsia="Times New Roman" w:hAnsiTheme="minorHAnsi" w:cstheme="minorHAnsi"/>
+                <w:lang w:val="es-EC" w:eastAsia="es-EC"/>
+              </w:rPr>
+            </w:pPr>
+            <w:r>
+              <w:rPr>
+                <w:rFonts w:asciiTheme="minorHAnsi" w:eastAsia="Times New Roman" w:hAnsiTheme="minorHAnsi" w:cstheme="minorHAnsi"/>
                 <w:lang w:val="es-EC" w:eastAsia="es-EC"/>
               </w:rPr>
               <w:t>Desplazamiento al punto de servicio</w:t>
@@ -4046,17 +3931,13 @@
               <w:spacing w:after="0" w:line="240" w:lineRule="auto"/>
               <w:jc w:val="center"/>
               <w:rPr>
-                <w:rFonts w:ascii="Times New Roman" w:eastAsia="Times New Roman" w:hAnsi="Times New Roman"/>
-                <w:sz w:val="24"/>
-                <w:szCs w:val="24"/>
-                <w:lang w:val="es-EC" w:eastAsia="es-EC"/>
-              </w:rPr>
-            </w:pPr>
-            <w:r>
-              <w:rPr>
-                <w:rFonts w:ascii="Times New Roman" w:eastAsia="Times New Roman" w:hAnsi="Times New Roman"/>
-                <w:sz w:val="24"/>
-                <w:szCs w:val="24"/>
+                <w:rFonts w:asciiTheme="minorHAnsi" w:eastAsia="Times New Roman" w:hAnsiTheme="minorHAnsi" w:cstheme="minorHAnsi"/>
+                <w:lang w:val="es-EC" w:eastAsia="es-EC"/>
+              </w:rPr>
+            </w:pPr>
+            <w:r>
+              <w:rPr>
+                <w:rFonts w:asciiTheme="minorHAnsi" w:eastAsia="Times New Roman" w:hAnsiTheme="minorHAnsi" w:cstheme="minorHAnsi"/>
                 <w:lang w:val="es-EC" w:eastAsia="es-EC"/>
               </w:rPr>
               <w:t>Empleado en restaurante</w:t>
@@ -4073,17 +3954,13 @@
               <w:spacing w:after="0" w:line="240" w:lineRule="auto"/>
               <w:jc w:val="center"/>
               <w:rPr>
-                <w:rFonts w:ascii="Times New Roman" w:eastAsia="Times New Roman" w:hAnsi="Times New Roman"/>
-                <w:sz w:val="24"/>
-                <w:szCs w:val="24"/>
-                <w:lang w:val="es-EC" w:eastAsia="es-EC"/>
-              </w:rPr>
-            </w:pPr>
-            <w:r>
-              <w:rPr>
-                <w:rFonts w:ascii="Times New Roman" w:eastAsia="Times New Roman" w:hAnsi="Times New Roman"/>
-                <w:sz w:val="24"/>
-                <w:szCs w:val="24"/>
+                <w:rFonts w:asciiTheme="minorHAnsi" w:eastAsia="Times New Roman" w:hAnsiTheme="minorHAnsi" w:cstheme="minorHAnsi"/>
+                <w:lang w:val="es-EC" w:eastAsia="es-EC"/>
+              </w:rPr>
+            </w:pPr>
+            <w:r>
+              <w:rPr>
+                <w:rFonts w:asciiTheme="minorHAnsi" w:eastAsia="Times New Roman" w:hAnsiTheme="minorHAnsi" w:cstheme="minorHAnsi"/>
                 <w:lang w:val="es-EC" w:eastAsia="es-EC"/>
               </w:rPr>
               <w:t>Empleado</w:t>
@@ -4100,17 +3977,13 @@
               <w:spacing w:after="0" w:line="240" w:lineRule="auto"/>
               <w:jc w:val="center"/>
               <w:rPr>
-                <w:rFonts w:ascii="Times New Roman" w:eastAsia="Times New Roman" w:hAnsi="Times New Roman"/>
-                <w:sz w:val="24"/>
-                <w:szCs w:val="24"/>
-                <w:lang w:val="es-EC" w:eastAsia="es-EC"/>
-              </w:rPr>
-            </w:pPr>
-            <w:r>
-              <w:rPr>
-                <w:rFonts w:ascii="Times New Roman" w:eastAsia="Times New Roman" w:hAnsi="Times New Roman"/>
-                <w:sz w:val="24"/>
-                <w:szCs w:val="24"/>
+                <w:rFonts w:asciiTheme="minorHAnsi" w:eastAsia="Times New Roman" w:hAnsiTheme="minorHAnsi" w:cstheme="minorHAnsi"/>
+                <w:lang w:val="es-EC" w:eastAsia="es-EC"/>
+              </w:rPr>
+            </w:pPr>
+            <w:r>
+              <w:rPr>
+                <w:rFonts w:asciiTheme="minorHAnsi" w:eastAsia="Times New Roman" w:hAnsiTheme="minorHAnsi" w:cstheme="minorHAnsi"/>
                 <w:lang w:val="es-EC" w:eastAsia="es-EC"/>
               </w:rPr>
               <w:t>—</w:t>
@@ -4129,17 +4002,13 @@
               <w:spacing w:after="0" w:line="240" w:lineRule="auto"/>
               <w:jc w:val="center"/>
               <w:rPr>
-                <w:rFonts w:ascii="Times New Roman" w:eastAsia="Times New Roman" w:hAnsi="Times New Roman"/>
-                <w:sz w:val="24"/>
-                <w:szCs w:val="24"/>
-                <w:lang w:val="es-EC" w:eastAsia="es-EC"/>
-              </w:rPr>
-            </w:pPr>
-            <w:r>
-              <w:rPr>
-                <w:rFonts w:ascii="Times New Roman" w:eastAsia="Times New Roman" w:hAnsi="Times New Roman"/>
-                <w:sz w:val="24"/>
-                <w:szCs w:val="24"/>
+                <w:rFonts w:asciiTheme="minorHAnsi" w:eastAsia="Times New Roman" w:hAnsiTheme="minorHAnsi" w:cstheme="minorHAnsi"/>
+                <w:lang w:val="es-EC" w:eastAsia="es-EC"/>
+              </w:rPr>
+            </w:pPr>
+            <w:r>
+              <w:rPr>
+                <w:rFonts w:asciiTheme="minorHAnsi" w:eastAsia="Times New Roman" w:hAnsiTheme="minorHAnsi" w:cstheme="minorHAnsi"/>
                 <w:lang w:val="es-EC" w:eastAsia="es-EC"/>
               </w:rPr>
               <w:t>4</w:t>
@@ -4156,17 +4025,13 @@
               <w:spacing w:after="0" w:line="240" w:lineRule="auto"/>
               <w:jc w:val="center"/>
               <w:rPr>
-                <w:rFonts w:ascii="Times New Roman" w:eastAsia="Times New Roman" w:hAnsi="Times New Roman"/>
-                <w:sz w:val="24"/>
-                <w:szCs w:val="24"/>
-                <w:lang w:val="es-EC" w:eastAsia="es-EC"/>
-              </w:rPr>
-            </w:pPr>
-            <w:r>
-              <w:rPr>
-                <w:rFonts w:ascii="Times New Roman" w:eastAsia="Times New Roman" w:hAnsi="Times New Roman"/>
-                <w:sz w:val="24"/>
-                <w:szCs w:val="24"/>
+                <w:rFonts w:asciiTheme="minorHAnsi" w:eastAsia="Times New Roman" w:hAnsiTheme="minorHAnsi" w:cstheme="minorHAnsi"/>
+                <w:lang w:val="es-EC" w:eastAsia="es-EC"/>
+              </w:rPr>
+            </w:pPr>
+            <w:r>
+              <w:rPr>
+                <w:rFonts w:asciiTheme="minorHAnsi" w:eastAsia="Times New Roman" w:hAnsiTheme="minorHAnsi" w:cstheme="minorHAnsi"/>
                 <w:lang w:val="es-EC" w:eastAsia="es-EC"/>
               </w:rPr>
               <w:t>Solicitar comida</w:t>
@@ -4183,17 +4048,13 @@
               <w:spacing w:after="0" w:line="240" w:lineRule="auto"/>
               <w:jc w:val="center"/>
               <w:rPr>
-                <w:rFonts w:ascii="Times New Roman" w:eastAsia="Times New Roman" w:hAnsi="Times New Roman"/>
-                <w:sz w:val="24"/>
-                <w:szCs w:val="24"/>
-                <w:lang w:val="es-EC" w:eastAsia="es-EC"/>
-              </w:rPr>
-            </w:pPr>
-            <w:r>
-              <w:rPr>
-                <w:rFonts w:ascii="Times New Roman" w:eastAsia="Times New Roman" w:hAnsi="Times New Roman"/>
-                <w:sz w:val="24"/>
-                <w:szCs w:val="24"/>
+                <w:rFonts w:asciiTheme="minorHAnsi" w:eastAsia="Times New Roman" w:hAnsiTheme="minorHAnsi" w:cstheme="minorHAnsi"/>
+                <w:lang w:val="es-EC" w:eastAsia="es-EC"/>
+              </w:rPr>
+            </w:pPr>
+            <w:r>
+              <w:rPr>
+                <w:rFonts w:asciiTheme="minorHAnsi" w:eastAsia="Times New Roman" w:hAnsiTheme="minorHAnsi" w:cstheme="minorHAnsi"/>
                 <w:lang w:val="es-EC" w:eastAsia="es-EC"/>
               </w:rPr>
               <w:t>El empleado solicita el servicio de alimentación en el restaurante</w:t>
@@ -4210,17 +4071,13 @@
               <w:spacing w:after="0" w:line="240" w:lineRule="auto"/>
               <w:jc w:val="center"/>
               <w:rPr>
-                <w:rFonts w:ascii="Times New Roman" w:eastAsia="Times New Roman" w:hAnsi="Times New Roman"/>
-                <w:sz w:val="24"/>
-                <w:szCs w:val="24"/>
-                <w:lang w:val="es-EC" w:eastAsia="es-EC"/>
-              </w:rPr>
-            </w:pPr>
-            <w:r>
-              <w:rPr>
-                <w:rFonts w:ascii="Times New Roman" w:eastAsia="Times New Roman" w:hAnsi="Times New Roman"/>
-                <w:sz w:val="24"/>
-                <w:szCs w:val="24"/>
+                <w:rFonts w:asciiTheme="minorHAnsi" w:eastAsia="Times New Roman" w:hAnsiTheme="minorHAnsi" w:cstheme="minorHAnsi"/>
+                <w:lang w:val="es-EC" w:eastAsia="es-EC"/>
+              </w:rPr>
+            </w:pPr>
+            <w:r>
+              <w:rPr>
+                <w:rFonts w:asciiTheme="minorHAnsi" w:eastAsia="Times New Roman" w:hAnsiTheme="minorHAnsi" w:cstheme="minorHAnsi"/>
                 <w:lang w:val="es-EC" w:eastAsia="es-EC"/>
               </w:rPr>
               <w:t>Solicitud del empleado</w:t>
@@ -4237,17 +4094,13 @@
               <w:spacing w:after="0" w:line="240" w:lineRule="auto"/>
               <w:jc w:val="center"/>
               <w:rPr>
-                <w:rFonts w:ascii="Times New Roman" w:eastAsia="Times New Roman" w:hAnsi="Times New Roman"/>
-                <w:sz w:val="24"/>
-                <w:szCs w:val="24"/>
-                <w:lang w:val="es-EC" w:eastAsia="es-EC"/>
-              </w:rPr>
-            </w:pPr>
-            <w:r>
-              <w:rPr>
-                <w:rFonts w:ascii="Times New Roman" w:eastAsia="Times New Roman" w:hAnsi="Times New Roman"/>
-                <w:sz w:val="24"/>
-                <w:szCs w:val="24"/>
+                <w:rFonts w:asciiTheme="minorHAnsi" w:eastAsia="Times New Roman" w:hAnsiTheme="minorHAnsi" w:cstheme="minorHAnsi"/>
+                <w:lang w:val="es-EC" w:eastAsia="es-EC"/>
+              </w:rPr>
+            </w:pPr>
+            <w:r>
+              <w:rPr>
+                <w:rFonts w:asciiTheme="minorHAnsi" w:eastAsia="Times New Roman" w:hAnsiTheme="minorHAnsi" w:cstheme="minorHAnsi"/>
                 <w:lang w:val="es-EC" w:eastAsia="es-EC"/>
               </w:rPr>
               <w:t>Recepción de solicitud</w:t>
@@ -4264,17 +4117,13 @@
               <w:spacing w:after="0" w:line="240" w:lineRule="auto"/>
               <w:jc w:val="center"/>
               <w:rPr>
-                <w:rFonts w:ascii="Times New Roman" w:eastAsia="Times New Roman" w:hAnsi="Times New Roman"/>
-                <w:sz w:val="24"/>
-                <w:szCs w:val="24"/>
-                <w:lang w:val="es-EC" w:eastAsia="es-EC"/>
-              </w:rPr>
-            </w:pPr>
-            <w:r>
-              <w:rPr>
-                <w:rFonts w:ascii="Times New Roman" w:eastAsia="Times New Roman" w:hAnsi="Times New Roman"/>
-                <w:sz w:val="24"/>
-                <w:szCs w:val="24"/>
+                <w:rFonts w:asciiTheme="minorHAnsi" w:eastAsia="Times New Roman" w:hAnsiTheme="minorHAnsi" w:cstheme="minorHAnsi"/>
+                <w:lang w:val="es-EC" w:eastAsia="es-EC"/>
+              </w:rPr>
+            </w:pPr>
+            <w:r>
+              <w:rPr>
+                <w:rFonts w:asciiTheme="minorHAnsi" w:eastAsia="Times New Roman" w:hAnsiTheme="minorHAnsi" w:cstheme="minorHAnsi"/>
                 <w:lang w:val="es-EC" w:eastAsia="es-EC"/>
               </w:rPr>
               <w:t>Solicitud registrada</w:t>
@@ -4291,17 +4140,13 @@
               <w:spacing w:after="0" w:line="240" w:lineRule="auto"/>
               <w:jc w:val="center"/>
               <w:rPr>
-                <w:rFonts w:ascii="Times New Roman" w:eastAsia="Times New Roman" w:hAnsi="Times New Roman"/>
-                <w:sz w:val="24"/>
-                <w:szCs w:val="24"/>
-                <w:lang w:val="es-EC" w:eastAsia="es-EC"/>
-              </w:rPr>
-            </w:pPr>
-            <w:r>
-              <w:rPr>
-                <w:rFonts w:ascii="Times New Roman" w:eastAsia="Times New Roman" w:hAnsi="Times New Roman"/>
-                <w:sz w:val="24"/>
-                <w:szCs w:val="24"/>
+                <w:rFonts w:asciiTheme="minorHAnsi" w:eastAsia="Times New Roman" w:hAnsiTheme="minorHAnsi" w:cstheme="minorHAnsi"/>
+                <w:lang w:val="es-EC" w:eastAsia="es-EC"/>
+              </w:rPr>
+            </w:pPr>
+            <w:r>
+              <w:rPr>
+                <w:rFonts w:asciiTheme="minorHAnsi" w:eastAsia="Times New Roman" w:hAnsiTheme="minorHAnsi" w:cstheme="minorHAnsi"/>
                 <w:lang w:val="es-EC" w:eastAsia="es-EC"/>
               </w:rPr>
               <w:t>Empleado</w:t>
@@ -4318,17 +4163,13 @@
               <w:spacing w:after="0" w:line="240" w:lineRule="auto"/>
               <w:jc w:val="center"/>
               <w:rPr>
-                <w:rFonts w:ascii="Times New Roman" w:eastAsia="Times New Roman" w:hAnsi="Times New Roman"/>
-                <w:sz w:val="24"/>
-                <w:szCs w:val="24"/>
-                <w:lang w:val="es-EC" w:eastAsia="es-EC"/>
-              </w:rPr>
-            </w:pPr>
-            <w:r>
-              <w:rPr>
-                <w:rFonts w:ascii="Times New Roman" w:eastAsia="Times New Roman" w:hAnsi="Times New Roman"/>
-                <w:sz w:val="24"/>
-                <w:szCs w:val="24"/>
+                <w:rFonts w:asciiTheme="minorHAnsi" w:eastAsia="Times New Roman" w:hAnsiTheme="minorHAnsi" w:cstheme="minorHAnsi"/>
+                <w:lang w:val="es-EC" w:eastAsia="es-EC"/>
+              </w:rPr>
+            </w:pPr>
+            <w:r>
+              <w:rPr>
+                <w:rFonts w:asciiTheme="minorHAnsi" w:eastAsia="Times New Roman" w:hAnsiTheme="minorHAnsi" w:cstheme="minorHAnsi"/>
                 <w:lang w:val="es-EC" w:eastAsia="es-EC"/>
               </w:rPr>
               <w:t>—</w:t>
@@ -4347,20 +4188,15 @@
               <w:spacing w:after="0" w:line="240" w:lineRule="auto"/>
               <w:jc w:val="center"/>
               <w:rPr>
-                <w:rFonts w:ascii="Times New Roman" w:eastAsia="Times New Roman" w:hAnsi="Times New Roman"/>
-                <w:sz w:val="24"/>
-                <w:szCs w:val="24"/>
-                <w:lang w:val="es-EC" w:eastAsia="es-EC"/>
-              </w:rPr>
-            </w:pPr>
-            <w:r>
-              <w:rPr>
-                <w:rFonts w:ascii="Times New Roman" w:eastAsia="Times New Roman" w:hAnsi="Times New Roman"/>
-                <w:sz w:val="24"/>
-                <w:szCs w:val="24"/>
-                <w:lang w:val="es-EC" w:eastAsia="es-EC"/>
-              </w:rPr>
-              <w:lastRenderedPageBreak/>
+                <w:rFonts w:asciiTheme="minorHAnsi" w:eastAsia="Times New Roman" w:hAnsiTheme="minorHAnsi" w:cstheme="minorHAnsi"/>
+                <w:lang w:val="es-EC" w:eastAsia="es-EC"/>
+              </w:rPr>
+            </w:pPr>
+            <w:r>
+              <w:rPr>
+                <w:rFonts w:asciiTheme="minorHAnsi" w:eastAsia="Times New Roman" w:hAnsiTheme="minorHAnsi" w:cstheme="minorHAnsi"/>
+                <w:lang w:val="es-EC" w:eastAsia="es-EC"/>
+              </w:rPr>
               <w:t>5</w:t>
             </w:r>
           </w:p>
@@ -4375,17 +4211,13 @@
               <w:spacing w:after="0" w:line="240" w:lineRule="auto"/>
               <w:jc w:val="center"/>
               <w:rPr>
-                <w:rFonts w:ascii="Times New Roman" w:eastAsia="Times New Roman" w:hAnsi="Times New Roman"/>
-                <w:sz w:val="24"/>
-                <w:szCs w:val="24"/>
-                <w:lang w:val="es-EC" w:eastAsia="es-EC"/>
-              </w:rPr>
-            </w:pPr>
-            <w:r>
-              <w:rPr>
-                <w:rFonts w:ascii="Times New Roman" w:eastAsia="Times New Roman" w:hAnsi="Times New Roman"/>
-                <w:sz w:val="24"/>
-                <w:szCs w:val="24"/>
+                <w:rFonts w:asciiTheme="minorHAnsi" w:eastAsia="Times New Roman" w:hAnsiTheme="minorHAnsi" w:cstheme="minorHAnsi"/>
+                <w:lang w:val="es-EC" w:eastAsia="es-EC"/>
+              </w:rPr>
+            </w:pPr>
+            <w:r>
+              <w:rPr>
+                <w:rFonts w:asciiTheme="minorHAnsi" w:eastAsia="Times New Roman" w:hAnsiTheme="minorHAnsi" w:cstheme="minorHAnsi"/>
                 <w:lang w:val="es-EC" w:eastAsia="es-EC"/>
               </w:rPr>
               <w:t>Atender solicitud</w:t>
@@ -4402,17 +4234,13 @@
               <w:spacing w:after="0" w:line="240" w:lineRule="auto"/>
               <w:jc w:val="center"/>
               <w:rPr>
-                <w:rFonts w:ascii="Times New Roman" w:eastAsia="Times New Roman" w:hAnsi="Times New Roman"/>
-                <w:sz w:val="24"/>
-                <w:szCs w:val="24"/>
-                <w:lang w:val="es-EC" w:eastAsia="es-EC"/>
-              </w:rPr>
-            </w:pPr>
-            <w:r>
-              <w:rPr>
-                <w:rFonts w:ascii="Times New Roman" w:eastAsia="Times New Roman" w:hAnsi="Times New Roman"/>
-                <w:sz w:val="24"/>
-                <w:szCs w:val="24"/>
+                <w:rFonts w:asciiTheme="minorHAnsi" w:eastAsia="Times New Roman" w:hAnsiTheme="minorHAnsi" w:cstheme="minorHAnsi"/>
+                <w:lang w:val="es-EC" w:eastAsia="es-EC"/>
+              </w:rPr>
+            </w:pPr>
+            <w:r>
+              <w:rPr>
+                <w:rFonts w:asciiTheme="minorHAnsi" w:eastAsia="Times New Roman" w:hAnsiTheme="minorHAnsi" w:cstheme="minorHAnsi"/>
                 <w:lang w:val="es-EC" w:eastAsia="es-EC"/>
               </w:rPr>
               <w:t>El restaurante recibe y atiende la solicitud del empleado</w:t>
@@ -4429,17 +4257,13 @@
               <w:spacing w:after="0" w:line="240" w:lineRule="auto"/>
               <w:jc w:val="center"/>
               <w:rPr>
-                <w:rFonts w:ascii="Times New Roman" w:eastAsia="Times New Roman" w:hAnsi="Times New Roman"/>
-                <w:sz w:val="24"/>
-                <w:szCs w:val="24"/>
-                <w:lang w:val="es-EC" w:eastAsia="es-EC"/>
-              </w:rPr>
-            </w:pPr>
-            <w:r>
-              <w:rPr>
-                <w:rFonts w:ascii="Times New Roman" w:eastAsia="Times New Roman" w:hAnsi="Times New Roman"/>
-                <w:sz w:val="24"/>
-                <w:szCs w:val="24"/>
+                <w:rFonts w:asciiTheme="minorHAnsi" w:eastAsia="Times New Roman" w:hAnsiTheme="minorHAnsi" w:cstheme="minorHAnsi"/>
+                <w:lang w:val="es-EC" w:eastAsia="es-EC"/>
+              </w:rPr>
+            </w:pPr>
+            <w:r>
+              <w:rPr>
+                <w:rFonts w:asciiTheme="minorHAnsi" w:eastAsia="Times New Roman" w:hAnsiTheme="minorHAnsi" w:cstheme="minorHAnsi"/>
                 <w:lang w:val="es-EC" w:eastAsia="es-EC"/>
               </w:rPr>
               <w:t>Solicitud de comida</w:t>
@@ -4456,17 +4280,13 @@
               <w:spacing w:after="0" w:line="240" w:lineRule="auto"/>
               <w:jc w:val="center"/>
               <w:rPr>
-                <w:rFonts w:ascii="Times New Roman" w:eastAsia="Times New Roman" w:hAnsi="Times New Roman"/>
-                <w:sz w:val="24"/>
-                <w:szCs w:val="24"/>
-                <w:lang w:val="es-EC" w:eastAsia="es-EC"/>
-              </w:rPr>
-            </w:pPr>
-            <w:r>
-              <w:rPr>
-                <w:rFonts w:ascii="Times New Roman" w:eastAsia="Times New Roman" w:hAnsi="Times New Roman"/>
-                <w:sz w:val="24"/>
-                <w:szCs w:val="24"/>
+                <w:rFonts w:asciiTheme="minorHAnsi" w:eastAsia="Times New Roman" w:hAnsiTheme="minorHAnsi" w:cstheme="minorHAnsi"/>
+                <w:lang w:val="es-EC" w:eastAsia="es-EC"/>
+              </w:rPr>
+            </w:pPr>
+            <w:r>
+              <w:rPr>
+                <w:rFonts w:asciiTheme="minorHAnsi" w:eastAsia="Times New Roman" w:hAnsiTheme="minorHAnsi" w:cstheme="minorHAnsi"/>
                 <w:lang w:val="es-EC" w:eastAsia="es-EC"/>
               </w:rPr>
               <w:t>Preparación/gestión del pedido</w:t>
@@ -4483,17 +4303,13 @@
               <w:spacing w:after="0" w:line="240" w:lineRule="auto"/>
               <w:jc w:val="center"/>
               <w:rPr>
-                <w:rFonts w:ascii="Times New Roman" w:eastAsia="Times New Roman" w:hAnsi="Times New Roman"/>
-                <w:sz w:val="24"/>
-                <w:szCs w:val="24"/>
-                <w:lang w:val="es-EC" w:eastAsia="es-EC"/>
-              </w:rPr>
-            </w:pPr>
-            <w:r>
-              <w:rPr>
-                <w:rFonts w:ascii="Times New Roman" w:eastAsia="Times New Roman" w:hAnsi="Times New Roman"/>
-                <w:sz w:val="24"/>
-                <w:szCs w:val="24"/>
+                <w:rFonts w:asciiTheme="minorHAnsi" w:eastAsia="Times New Roman" w:hAnsiTheme="minorHAnsi" w:cstheme="minorHAnsi"/>
+                <w:lang w:val="es-EC" w:eastAsia="es-EC"/>
+              </w:rPr>
+            </w:pPr>
+            <w:r>
+              <w:rPr>
+                <w:rFonts w:asciiTheme="minorHAnsi" w:eastAsia="Times New Roman" w:hAnsiTheme="minorHAnsi" w:cstheme="minorHAnsi"/>
                 <w:lang w:val="es-EC" w:eastAsia="es-EC"/>
               </w:rPr>
               <w:t>Pedido atendido</w:t>
@@ -4510,17 +4326,13 @@
               <w:spacing w:after="0" w:line="240" w:lineRule="auto"/>
               <w:jc w:val="center"/>
               <w:rPr>
-                <w:rFonts w:ascii="Times New Roman" w:eastAsia="Times New Roman" w:hAnsi="Times New Roman"/>
-                <w:sz w:val="24"/>
-                <w:szCs w:val="24"/>
-                <w:lang w:val="es-EC" w:eastAsia="es-EC"/>
-              </w:rPr>
-            </w:pPr>
-            <w:r>
-              <w:rPr>
-                <w:rFonts w:ascii="Times New Roman" w:eastAsia="Times New Roman" w:hAnsi="Times New Roman"/>
-                <w:sz w:val="24"/>
-                <w:szCs w:val="24"/>
+                <w:rFonts w:asciiTheme="minorHAnsi" w:eastAsia="Times New Roman" w:hAnsiTheme="minorHAnsi" w:cstheme="minorHAnsi"/>
+                <w:lang w:val="es-EC" w:eastAsia="es-EC"/>
+              </w:rPr>
+            </w:pPr>
+            <w:r>
+              <w:rPr>
+                <w:rFonts w:asciiTheme="minorHAnsi" w:eastAsia="Times New Roman" w:hAnsiTheme="minorHAnsi" w:cstheme="minorHAnsi"/>
                 <w:lang w:val="es-EC" w:eastAsia="es-EC"/>
               </w:rPr>
               <w:t>Restaurante</w:t>
@@ -4537,17 +4349,13 @@
               <w:spacing w:after="0" w:line="240" w:lineRule="auto"/>
               <w:jc w:val="center"/>
               <w:rPr>
-                <w:rFonts w:ascii="Times New Roman" w:eastAsia="Times New Roman" w:hAnsi="Times New Roman"/>
-                <w:sz w:val="24"/>
-                <w:szCs w:val="24"/>
-                <w:lang w:val="es-EC" w:eastAsia="es-EC"/>
-              </w:rPr>
-            </w:pPr>
-            <w:r>
-              <w:rPr>
-                <w:rFonts w:ascii="Times New Roman" w:eastAsia="Times New Roman" w:hAnsi="Times New Roman"/>
-                <w:sz w:val="24"/>
-                <w:szCs w:val="24"/>
+                <w:rFonts w:asciiTheme="minorHAnsi" w:eastAsia="Times New Roman" w:hAnsiTheme="minorHAnsi" w:cstheme="minorHAnsi"/>
+                <w:lang w:val="es-EC" w:eastAsia="es-EC"/>
+              </w:rPr>
+            </w:pPr>
+            <w:r>
+              <w:rPr>
+                <w:rFonts w:asciiTheme="minorHAnsi" w:eastAsia="Times New Roman" w:hAnsiTheme="minorHAnsi" w:cstheme="minorHAnsi"/>
                 <w:lang w:val="es-EC" w:eastAsia="es-EC"/>
               </w:rPr>
               <w:t>—</w:t>
@@ -4566,17 +4374,13 @@
               <w:spacing w:after="0" w:line="240" w:lineRule="auto"/>
               <w:jc w:val="center"/>
               <w:rPr>
-                <w:rFonts w:ascii="Times New Roman" w:eastAsia="Times New Roman" w:hAnsi="Times New Roman"/>
-                <w:sz w:val="24"/>
-                <w:szCs w:val="24"/>
-                <w:lang w:val="es-EC" w:eastAsia="es-EC"/>
-              </w:rPr>
-            </w:pPr>
-            <w:r>
-              <w:rPr>
-                <w:rFonts w:ascii="Times New Roman" w:eastAsia="Times New Roman" w:hAnsi="Times New Roman"/>
-                <w:sz w:val="24"/>
-                <w:szCs w:val="24"/>
+                <w:rFonts w:asciiTheme="minorHAnsi" w:eastAsia="Times New Roman" w:hAnsiTheme="minorHAnsi" w:cstheme="minorHAnsi"/>
+                <w:lang w:val="es-EC" w:eastAsia="es-EC"/>
+              </w:rPr>
+            </w:pPr>
+            <w:r>
+              <w:rPr>
+                <w:rFonts w:asciiTheme="minorHAnsi" w:eastAsia="Times New Roman" w:hAnsiTheme="minorHAnsi" w:cstheme="minorHAnsi"/>
                 <w:lang w:val="es-EC" w:eastAsia="es-EC"/>
               </w:rPr>
               <w:t>6</w:t>
@@ -4593,17 +4397,13 @@
               <w:spacing w:after="0" w:line="240" w:lineRule="auto"/>
               <w:jc w:val="center"/>
               <w:rPr>
-                <w:rFonts w:ascii="Times New Roman" w:eastAsia="Times New Roman" w:hAnsi="Times New Roman"/>
-                <w:sz w:val="24"/>
-                <w:szCs w:val="24"/>
-                <w:lang w:val="es-EC" w:eastAsia="es-EC"/>
-              </w:rPr>
-            </w:pPr>
-            <w:r>
-              <w:rPr>
-                <w:rFonts w:ascii="Times New Roman" w:eastAsia="Times New Roman" w:hAnsi="Times New Roman"/>
-                <w:sz w:val="24"/>
-                <w:szCs w:val="24"/>
+                <w:rFonts w:asciiTheme="minorHAnsi" w:eastAsia="Times New Roman" w:hAnsiTheme="minorHAnsi" w:cstheme="minorHAnsi"/>
+                <w:lang w:val="es-EC" w:eastAsia="es-EC"/>
+              </w:rPr>
+            </w:pPr>
+            <w:r>
+              <w:rPr>
+                <w:rFonts w:asciiTheme="minorHAnsi" w:eastAsia="Times New Roman" w:hAnsiTheme="minorHAnsi" w:cstheme="minorHAnsi"/>
                 <w:lang w:val="es-EC" w:eastAsia="es-EC"/>
               </w:rPr>
               <w:t>Verificar autorización</w:t>
@@ -4620,17 +4420,13 @@
               <w:spacing w:after="0" w:line="240" w:lineRule="auto"/>
               <w:jc w:val="center"/>
               <w:rPr>
-                <w:rFonts w:ascii="Times New Roman" w:eastAsia="Times New Roman" w:hAnsi="Times New Roman"/>
-                <w:sz w:val="24"/>
-                <w:szCs w:val="24"/>
-                <w:lang w:val="es-EC" w:eastAsia="es-EC"/>
-              </w:rPr>
-            </w:pPr>
-            <w:r>
-              <w:rPr>
-                <w:rFonts w:ascii="Times New Roman" w:eastAsia="Times New Roman" w:hAnsi="Times New Roman"/>
-                <w:sz w:val="24"/>
-                <w:szCs w:val="24"/>
+                <w:rFonts w:asciiTheme="minorHAnsi" w:eastAsia="Times New Roman" w:hAnsiTheme="minorHAnsi" w:cstheme="minorHAnsi"/>
+                <w:lang w:val="es-EC" w:eastAsia="es-EC"/>
+              </w:rPr>
+            </w:pPr>
+            <w:r>
+              <w:rPr>
+                <w:rFonts w:asciiTheme="minorHAnsi" w:eastAsia="Times New Roman" w:hAnsiTheme="minorHAnsi" w:cstheme="minorHAnsi"/>
                 <w:lang w:val="es-EC" w:eastAsia="es-EC"/>
               </w:rPr>
               <w:t>El restaurante verifica si el empleado está autorizado para consumir</w:t>
@@ -4647,17 +4443,13 @@
               <w:spacing w:after="0" w:line="240" w:lineRule="auto"/>
               <w:jc w:val="center"/>
               <w:rPr>
-                <w:rFonts w:ascii="Times New Roman" w:eastAsia="Times New Roman" w:hAnsi="Times New Roman"/>
-                <w:sz w:val="24"/>
-                <w:szCs w:val="24"/>
-                <w:lang w:val="es-EC" w:eastAsia="es-EC"/>
-              </w:rPr>
-            </w:pPr>
-            <w:r>
-              <w:rPr>
-                <w:rFonts w:ascii="Times New Roman" w:eastAsia="Times New Roman" w:hAnsi="Times New Roman"/>
-                <w:sz w:val="24"/>
-                <w:szCs w:val="24"/>
+                <w:rFonts w:asciiTheme="minorHAnsi" w:eastAsia="Times New Roman" w:hAnsiTheme="minorHAnsi" w:cstheme="minorHAnsi"/>
+                <w:lang w:val="es-EC" w:eastAsia="es-EC"/>
+              </w:rPr>
+            </w:pPr>
+            <w:r>
+              <w:rPr>
+                <w:rFonts w:asciiTheme="minorHAnsi" w:eastAsia="Times New Roman" w:hAnsiTheme="minorHAnsi" w:cstheme="minorHAnsi"/>
                 <w:lang w:val="es-EC" w:eastAsia="es-EC"/>
               </w:rPr>
               <w:t>Datos del empleado</w:t>
@@ -4674,17 +4466,13 @@
               <w:spacing w:after="0" w:line="240" w:lineRule="auto"/>
               <w:jc w:val="center"/>
               <w:rPr>
-                <w:rFonts w:ascii="Times New Roman" w:eastAsia="Times New Roman" w:hAnsi="Times New Roman"/>
-                <w:sz w:val="24"/>
-                <w:szCs w:val="24"/>
-                <w:lang w:val="es-EC" w:eastAsia="es-EC"/>
-              </w:rPr>
-            </w:pPr>
-            <w:r>
-              <w:rPr>
-                <w:rFonts w:ascii="Times New Roman" w:eastAsia="Times New Roman" w:hAnsi="Times New Roman"/>
-                <w:sz w:val="24"/>
-                <w:szCs w:val="24"/>
+                <w:rFonts w:asciiTheme="minorHAnsi" w:eastAsia="Times New Roman" w:hAnsiTheme="minorHAnsi" w:cstheme="minorHAnsi"/>
+                <w:lang w:val="es-EC" w:eastAsia="es-EC"/>
+              </w:rPr>
+            </w:pPr>
+            <w:r>
+              <w:rPr>
+                <w:rFonts w:asciiTheme="minorHAnsi" w:eastAsia="Times New Roman" w:hAnsiTheme="minorHAnsi" w:cstheme="minorHAnsi"/>
                 <w:lang w:val="es-EC" w:eastAsia="es-EC"/>
               </w:rPr>
               <w:t>Validación manual</w:t>
@@ -4701,17 +4489,13 @@
               <w:spacing w:after="0" w:line="240" w:lineRule="auto"/>
               <w:jc w:val="center"/>
               <w:rPr>
-                <w:rFonts w:ascii="Times New Roman" w:eastAsia="Times New Roman" w:hAnsi="Times New Roman"/>
-                <w:sz w:val="24"/>
-                <w:szCs w:val="24"/>
-                <w:lang w:val="es-EC" w:eastAsia="es-EC"/>
-              </w:rPr>
-            </w:pPr>
-            <w:r>
-              <w:rPr>
-                <w:rFonts w:ascii="Times New Roman" w:eastAsia="Times New Roman" w:hAnsi="Times New Roman"/>
-                <w:sz w:val="24"/>
-                <w:szCs w:val="24"/>
+                <w:rFonts w:asciiTheme="minorHAnsi" w:eastAsia="Times New Roman" w:hAnsiTheme="minorHAnsi" w:cstheme="minorHAnsi"/>
+                <w:lang w:val="es-EC" w:eastAsia="es-EC"/>
+              </w:rPr>
+            </w:pPr>
+            <w:r>
+              <w:rPr>
+                <w:rFonts w:asciiTheme="minorHAnsi" w:eastAsia="Times New Roman" w:hAnsiTheme="minorHAnsi" w:cstheme="minorHAnsi"/>
                 <w:lang w:val="es-EC" w:eastAsia="es-EC"/>
               </w:rPr>
               <w:t>Autorización o rechazo</w:t>
@@ -4728,17 +4512,13 @@
               <w:spacing w:after="0" w:line="240" w:lineRule="auto"/>
               <w:jc w:val="center"/>
               <w:rPr>
-                <w:rFonts w:ascii="Times New Roman" w:eastAsia="Times New Roman" w:hAnsi="Times New Roman"/>
-                <w:sz w:val="24"/>
-                <w:szCs w:val="24"/>
-                <w:lang w:val="es-EC" w:eastAsia="es-EC"/>
-              </w:rPr>
-            </w:pPr>
-            <w:r>
-              <w:rPr>
-                <w:rFonts w:ascii="Times New Roman" w:eastAsia="Times New Roman" w:hAnsi="Times New Roman"/>
-                <w:sz w:val="24"/>
-                <w:szCs w:val="24"/>
+                <w:rFonts w:asciiTheme="minorHAnsi" w:eastAsia="Times New Roman" w:hAnsiTheme="minorHAnsi" w:cstheme="minorHAnsi"/>
+                <w:lang w:val="es-EC" w:eastAsia="es-EC"/>
+              </w:rPr>
+            </w:pPr>
+            <w:r>
+              <w:rPr>
+                <w:rFonts w:asciiTheme="minorHAnsi" w:eastAsia="Times New Roman" w:hAnsiTheme="minorHAnsi" w:cstheme="minorHAnsi"/>
                 <w:lang w:val="es-EC" w:eastAsia="es-EC"/>
               </w:rPr>
               <w:t>Restaurante</w:t>
@@ -4755,17 +4535,13 @@
               <w:spacing w:after="0" w:line="240" w:lineRule="auto"/>
               <w:jc w:val="center"/>
               <w:rPr>
-                <w:rFonts w:ascii="Times New Roman" w:eastAsia="Times New Roman" w:hAnsi="Times New Roman"/>
-                <w:sz w:val="24"/>
-                <w:szCs w:val="24"/>
-                <w:lang w:val="es-EC" w:eastAsia="es-EC"/>
-              </w:rPr>
-            </w:pPr>
-            <w:r>
-              <w:rPr>
-                <w:rFonts w:ascii="Times New Roman" w:eastAsia="Times New Roman" w:hAnsi="Times New Roman"/>
-                <w:sz w:val="24"/>
-                <w:szCs w:val="24"/>
+                <w:rFonts w:asciiTheme="minorHAnsi" w:eastAsia="Times New Roman" w:hAnsiTheme="minorHAnsi" w:cstheme="minorHAnsi"/>
+                <w:lang w:val="es-EC" w:eastAsia="es-EC"/>
+              </w:rPr>
+            </w:pPr>
+            <w:r>
+              <w:rPr>
+                <w:rFonts w:asciiTheme="minorHAnsi" w:eastAsia="Times New Roman" w:hAnsiTheme="minorHAnsi" w:cstheme="minorHAnsi"/>
                 <w:lang w:val="es-EC" w:eastAsia="es-EC"/>
               </w:rPr>
               <w:t>Registro / lista</w:t>
@@ -4784,17 +4560,13 @@
               <w:spacing w:after="0" w:line="240" w:lineRule="auto"/>
               <w:jc w:val="center"/>
               <w:rPr>
-                <w:rFonts w:ascii="Times New Roman" w:eastAsia="Times New Roman" w:hAnsi="Times New Roman"/>
-                <w:sz w:val="24"/>
-                <w:szCs w:val="24"/>
-                <w:lang w:val="es-EC" w:eastAsia="es-EC"/>
-              </w:rPr>
-            </w:pPr>
-            <w:r>
-              <w:rPr>
-                <w:rFonts w:ascii="Times New Roman" w:eastAsia="Times New Roman" w:hAnsi="Times New Roman"/>
-                <w:sz w:val="24"/>
-                <w:szCs w:val="24"/>
+                <w:rFonts w:asciiTheme="minorHAnsi" w:eastAsia="Times New Roman" w:hAnsiTheme="minorHAnsi" w:cstheme="minorHAnsi"/>
+                <w:lang w:val="es-EC" w:eastAsia="es-EC"/>
+              </w:rPr>
+            </w:pPr>
+            <w:r>
+              <w:rPr>
+                <w:rFonts w:asciiTheme="minorHAnsi" w:eastAsia="Times New Roman" w:hAnsiTheme="minorHAnsi" w:cstheme="minorHAnsi"/>
                 <w:lang w:val="es-EC" w:eastAsia="es-EC"/>
               </w:rPr>
               <w:t>7</w:t>
@@ -4811,17 +4583,13 @@
               <w:spacing w:after="0" w:line="240" w:lineRule="auto"/>
               <w:jc w:val="center"/>
               <w:rPr>
-                <w:rFonts w:ascii="Times New Roman" w:eastAsia="Times New Roman" w:hAnsi="Times New Roman"/>
-                <w:sz w:val="24"/>
-                <w:szCs w:val="24"/>
-                <w:lang w:val="es-EC" w:eastAsia="es-EC"/>
-              </w:rPr>
-            </w:pPr>
-            <w:r>
-              <w:rPr>
-                <w:rFonts w:ascii="Times New Roman" w:eastAsia="Times New Roman" w:hAnsi="Times New Roman"/>
-                <w:sz w:val="24"/>
-                <w:szCs w:val="24"/>
+                <w:rFonts w:asciiTheme="minorHAnsi" w:eastAsia="Times New Roman" w:hAnsiTheme="minorHAnsi" w:cstheme="minorHAnsi"/>
+                <w:lang w:val="es-EC" w:eastAsia="es-EC"/>
+              </w:rPr>
+            </w:pPr>
+            <w:r>
+              <w:rPr>
+                <w:rFonts w:asciiTheme="minorHAnsi" w:eastAsia="Times New Roman" w:hAnsiTheme="minorHAnsi" w:cstheme="minorHAnsi"/>
                 <w:lang w:val="es-EC" w:eastAsia="es-EC"/>
               </w:rPr>
               <w:t>Registrar consumo manualmente</w:t>
@@ -4838,17 +4606,13 @@
               <w:spacing w:after="0" w:line="240" w:lineRule="auto"/>
               <w:jc w:val="center"/>
               <w:rPr>
-                <w:rFonts w:ascii="Times New Roman" w:eastAsia="Times New Roman" w:hAnsi="Times New Roman"/>
-                <w:sz w:val="24"/>
-                <w:szCs w:val="24"/>
-                <w:lang w:val="es-EC" w:eastAsia="es-EC"/>
-              </w:rPr>
-            </w:pPr>
-            <w:r>
-              <w:rPr>
-                <w:rFonts w:ascii="Times New Roman" w:eastAsia="Times New Roman" w:hAnsi="Times New Roman"/>
-                <w:sz w:val="24"/>
-                <w:szCs w:val="24"/>
+                <w:rFonts w:asciiTheme="minorHAnsi" w:eastAsia="Times New Roman" w:hAnsiTheme="minorHAnsi" w:cstheme="minorHAnsi"/>
+                <w:lang w:val="es-EC" w:eastAsia="es-EC"/>
+              </w:rPr>
+            </w:pPr>
+            <w:r>
+              <w:rPr>
+                <w:rFonts w:asciiTheme="minorHAnsi" w:eastAsia="Times New Roman" w:hAnsiTheme="minorHAnsi" w:cstheme="minorHAnsi"/>
                 <w:lang w:val="es-EC" w:eastAsia="es-EC"/>
               </w:rPr>
               <w:t>Se registra el consumo del empleado autorizado</w:t>
@@ -4865,17 +4629,13 @@
               <w:spacing w:after="0" w:line="240" w:lineRule="auto"/>
               <w:jc w:val="center"/>
               <w:rPr>
-                <w:rFonts w:ascii="Times New Roman" w:eastAsia="Times New Roman" w:hAnsi="Times New Roman"/>
-                <w:sz w:val="24"/>
-                <w:szCs w:val="24"/>
-                <w:lang w:val="es-EC" w:eastAsia="es-EC"/>
-              </w:rPr>
-            </w:pPr>
-            <w:r>
-              <w:rPr>
-                <w:rFonts w:ascii="Times New Roman" w:eastAsia="Times New Roman" w:hAnsi="Times New Roman"/>
-                <w:sz w:val="24"/>
-                <w:szCs w:val="24"/>
+                <w:rFonts w:asciiTheme="minorHAnsi" w:eastAsia="Times New Roman" w:hAnsiTheme="minorHAnsi" w:cstheme="minorHAnsi"/>
+                <w:lang w:val="es-EC" w:eastAsia="es-EC"/>
+              </w:rPr>
+            </w:pPr>
+            <w:r>
+              <w:rPr>
+                <w:rFonts w:asciiTheme="minorHAnsi" w:eastAsia="Times New Roman" w:hAnsiTheme="minorHAnsi" w:cstheme="minorHAnsi"/>
                 <w:lang w:val="es-EC" w:eastAsia="es-EC"/>
               </w:rPr>
               <w:t>Consumo realizado</w:t>
@@ -4892,17 +4652,13 @@
               <w:spacing w:after="0" w:line="240" w:lineRule="auto"/>
               <w:jc w:val="center"/>
               <w:rPr>
-                <w:rFonts w:ascii="Times New Roman" w:eastAsia="Times New Roman" w:hAnsi="Times New Roman"/>
-                <w:sz w:val="24"/>
-                <w:szCs w:val="24"/>
-                <w:lang w:val="es-EC" w:eastAsia="es-EC"/>
-              </w:rPr>
-            </w:pPr>
-            <w:r>
-              <w:rPr>
-                <w:rFonts w:ascii="Times New Roman" w:eastAsia="Times New Roman" w:hAnsi="Times New Roman"/>
-                <w:sz w:val="24"/>
-                <w:szCs w:val="24"/>
+                <w:rFonts w:asciiTheme="minorHAnsi" w:eastAsia="Times New Roman" w:hAnsiTheme="minorHAnsi" w:cstheme="minorHAnsi"/>
+                <w:lang w:val="es-EC" w:eastAsia="es-EC"/>
+              </w:rPr>
+            </w:pPr>
+            <w:r>
+              <w:rPr>
+                <w:rFonts w:asciiTheme="minorHAnsi" w:eastAsia="Times New Roman" w:hAnsiTheme="minorHAnsi" w:cstheme="minorHAnsi"/>
                 <w:lang w:val="es-EC" w:eastAsia="es-EC"/>
               </w:rPr>
               <w:t>Registro manual</w:t>
@@ -4919,17 +4675,13 @@
               <w:spacing w:after="0" w:line="240" w:lineRule="auto"/>
               <w:jc w:val="center"/>
               <w:rPr>
-                <w:rFonts w:ascii="Times New Roman" w:eastAsia="Times New Roman" w:hAnsi="Times New Roman"/>
-                <w:sz w:val="24"/>
-                <w:szCs w:val="24"/>
-                <w:lang w:val="es-EC" w:eastAsia="es-EC"/>
-              </w:rPr>
-            </w:pPr>
-            <w:r>
-              <w:rPr>
-                <w:rFonts w:ascii="Times New Roman" w:eastAsia="Times New Roman" w:hAnsi="Times New Roman"/>
-                <w:sz w:val="24"/>
-                <w:szCs w:val="24"/>
+                <w:rFonts w:asciiTheme="minorHAnsi" w:eastAsia="Times New Roman" w:hAnsiTheme="minorHAnsi" w:cstheme="minorHAnsi"/>
+                <w:lang w:val="es-EC" w:eastAsia="es-EC"/>
+              </w:rPr>
+            </w:pPr>
+            <w:r>
+              <w:rPr>
+                <w:rFonts w:asciiTheme="minorHAnsi" w:eastAsia="Times New Roman" w:hAnsiTheme="minorHAnsi" w:cstheme="minorHAnsi"/>
                 <w:lang w:val="es-EC" w:eastAsia="es-EC"/>
               </w:rPr>
               <w:t>Consumo registrado</w:t>
@@ -4946,17 +4698,13 @@
               <w:spacing w:after="0" w:line="240" w:lineRule="auto"/>
               <w:jc w:val="center"/>
               <w:rPr>
-                <w:rFonts w:ascii="Times New Roman" w:eastAsia="Times New Roman" w:hAnsi="Times New Roman"/>
-                <w:sz w:val="24"/>
-                <w:szCs w:val="24"/>
-                <w:lang w:val="es-EC" w:eastAsia="es-EC"/>
-              </w:rPr>
-            </w:pPr>
-            <w:r>
-              <w:rPr>
-                <w:rFonts w:ascii="Times New Roman" w:eastAsia="Times New Roman" w:hAnsi="Times New Roman"/>
-                <w:sz w:val="24"/>
-                <w:szCs w:val="24"/>
+                <w:rFonts w:asciiTheme="minorHAnsi" w:eastAsia="Times New Roman" w:hAnsiTheme="minorHAnsi" w:cstheme="minorHAnsi"/>
+                <w:lang w:val="es-EC" w:eastAsia="es-EC"/>
+              </w:rPr>
+            </w:pPr>
+            <w:r>
+              <w:rPr>
+                <w:rFonts w:asciiTheme="minorHAnsi" w:eastAsia="Times New Roman" w:hAnsiTheme="minorHAnsi" w:cstheme="minorHAnsi"/>
                 <w:lang w:val="es-EC" w:eastAsia="es-EC"/>
               </w:rPr>
               <w:t>Restaurante</w:t>
@@ -4973,17 +4721,13 @@
               <w:spacing w:after="0" w:line="240" w:lineRule="auto"/>
               <w:jc w:val="center"/>
               <w:rPr>
-                <w:rFonts w:ascii="Times New Roman" w:eastAsia="Times New Roman" w:hAnsi="Times New Roman"/>
-                <w:sz w:val="24"/>
-                <w:szCs w:val="24"/>
-                <w:lang w:val="es-EC" w:eastAsia="es-EC"/>
-              </w:rPr>
-            </w:pPr>
-            <w:r>
-              <w:rPr>
-                <w:rFonts w:ascii="Times New Roman" w:eastAsia="Times New Roman" w:hAnsi="Times New Roman"/>
-                <w:sz w:val="24"/>
-                <w:szCs w:val="24"/>
+                <w:rFonts w:asciiTheme="minorHAnsi" w:eastAsia="Times New Roman" w:hAnsiTheme="minorHAnsi" w:cstheme="minorHAnsi"/>
+                <w:lang w:val="es-EC" w:eastAsia="es-EC"/>
+              </w:rPr>
+            </w:pPr>
+            <w:r>
+              <w:rPr>
+                <w:rFonts w:asciiTheme="minorHAnsi" w:eastAsia="Times New Roman" w:hAnsiTheme="minorHAnsi" w:cstheme="minorHAnsi"/>
                 <w:lang w:val="es-EC" w:eastAsia="es-EC"/>
               </w:rPr>
               <w:t>Registro de consumo</w:t>
@@ -5002,19 +4746,16 @@
               <w:spacing w:after="0" w:line="240" w:lineRule="auto"/>
               <w:jc w:val="center"/>
               <w:rPr>
-                <w:rFonts w:ascii="Times New Roman" w:eastAsia="Times New Roman" w:hAnsi="Times New Roman"/>
-                <w:sz w:val="24"/>
-                <w:szCs w:val="24"/>
-                <w:lang w:val="es-EC" w:eastAsia="es-EC"/>
-              </w:rPr>
-            </w:pPr>
-            <w:r>
-              <w:rPr>
-                <w:rFonts w:ascii="Times New Roman" w:eastAsia="Times New Roman" w:hAnsi="Times New Roman"/>
-                <w:sz w:val="24"/>
-                <w:szCs w:val="24"/>
-                <w:lang w:val="es-EC" w:eastAsia="es-EC"/>
-              </w:rPr>
+                <w:rFonts w:asciiTheme="minorHAnsi" w:eastAsia="Times New Roman" w:hAnsiTheme="minorHAnsi" w:cstheme="minorHAnsi"/>
+                <w:lang w:val="es-EC" w:eastAsia="es-EC"/>
+              </w:rPr>
+            </w:pPr>
+            <w:r>
+              <w:rPr>
+                <w:rFonts w:asciiTheme="minorHAnsi" w:eastAsia="Times New Roman" w:hAnsiTheme="minorHAnsi" w:cstheme="minorHAnsi"/>
+                <w:lang w:val="es-EC" w:eastAsia="es-EC"/>
+              </w:rPr>
+              <w:lastRenderedPageBreak/>
               <w:t>8</w:t>
             </w:r>
           </w:p>
@@ -5029,17 +4770,13 @@
               <w:spacing w:after="0" w:line="240" w:lineRule="auto"/>
               <w:jc w:val="center"/>
               <w:rPr>
-                <w:rFonts w:ascii="Times New Roman" w:eastAsia="Times New Roman" w:hAnsi="Times New Roman"/>
-                <w:sz w:val="24"/>
-                <w:szCs w:val="24"/>
-                <w:lang w:val="es-EC" w:eastAsia="es-EC"/>
-              </w:rPr>
-            </w:pPr>
-            <w:r>
-              <w:rPr>
-                <w:rFonts w:ascii="Times New Roman" w:eastAsia="Times New Roman" w:hAnsi="Times New Roman"/>
-                <w:sz w:val="24"/>
-                <w:szCs w:val="24"/>
+                <w:rFonts w:asciiTheme="minorHAnsi" w:eastAsia="Times New Roman" w:hAnsiTheme="minorHAnsi" w:cstheme="minorHAnsi"/>
+                <w:lang w:val="es-EC" w:eastAsia="es-EC"/>
+              </w:rPr>
+            </w:pPr>
+            <w:r>
+              <w:rPr>
+                <w:rFonts w:asciiTheme="minorHAnsi" w:eastAsia="Times New Roman" w:hAnsiTheme="minorHAnsi" w:cstheme="minorHAnsi"/>
                 <w:lang w:val="es-EC" w:eastAsia="es-EC"/>
               </w:rPr>
               <w:t>Entregar comida</w:t>
@@ -5056,17 +4793,13 @@
               <w:spacing w:after="0" w:line="240" w:lineRule="auto"/>
               <w:jc w:val="center"/>
               <w:rPr>
-                <w:rFonts w:ascii="Times New Roman" w:eastAsia="Times New Roman" w:hAnsi="Times New Roman"/>
-                <w:sz w:val="24"/>
-                <w:szCs w:val="24"/>
-                <w:lang w:val="es-EC" w:eastAsia="es-EC"/>
-              </w:rPr>
-            </w:pPr>
-            <w:r>
-              <w:rPr>
-                <w:rFonts w:ascii="Times New Roman" w:eastAsia="Times New Roman" w:hAnsi="Times New Roman"/>
-                <w:sz w:val="24"/>
-                <w:szCs w:val="24"/>
+                <w:rFonts w:asciiTheme="minorHAnsi" w:eastAsia="Times New Roman" w:hAnsiTheme="minorHAnsi" w:cstheme="minorHAnsi"/>
+                <w:lang w:val="es-EC" w:eastAsia="es-EC"/>
+              </w:rPr>
+            </w:pPr>
+            <w:r>
+              <w:rPr>
+                <w:rFonts w:asciiTheme="minorHAnsi" w:eastAsia="Times New Roman" w:hAnsiTheme="minorHAnsi" w:cstheme="minorHAnsi"/>
                 <w:lang w:val="es-EC" w:eastAsia="es-EC"/>
               </w:rPr>
               <w:t>El restaurante entrega el servicio de alimentación al empleado</w:t>
@@ -5083,17 +4816,13 @@
               <w:spacing w:after="0" w:line="240" w:lineRule="auto"/>
               <w:jc w:val="center"/>
               <w:rPr>
-                <w:rFonts w:ascii="Times New Roman" w:eastAsia="Times New Roman" w:hAnsi="Times New Roman"/>
-                <w:sz w:val="24"/>
-                <w:szCs w:val="24"/>
-                <w:lang w:val="es-EC" w:eastAsia="es-EC"/>
-              </w:rPr>
-            </w:pPr>
-            <w:r>
-              <w:rPr>
-                <w:rFonts w:ascii="Times New Roman" w:eastAsia="Times New Roman" w:hAnsi="Times New Roman"/>
-                <w:sz w:val="24"/>
-                <w:szCs w:val="24"/>
+                <w:rFonts w:asciiTheme="minorHAnsi" w:eastAsia="Times New Roman" w:hAnsiTheme="minorHAnsi" w:cstheme="minorHAnsi"/>
+                <w:lang w:val="es-EC" w:eastAsia="es-EC"/>
+              </w:rPr>
+            </w:pPr>
+            <w:r>
+              <w:rPr>
+                <w:rFonts w:asciiTheme="minorHAnsi" w:eastAsia="Times New Roman" w:hAnsiTheme="minorHAnsi" w:cstheme="minorHAnsi"/>
                 <w:lang w:val="es-EC" w:eastAsia="es-EC"/>
               </w:rPr>
               <w:t>Consumo aprobado</w:t>
@@ -5110,17 +4839,13 @@
               <w:spacing w:after="0" w:line="240" w:lineRule="auto"/>
               <w:jc w:val="center"/>
               <w:rPr>
-                <w:rFonts w:ascii="Times New Roman" w:eastAsia="Times New Roman" w:hAnsi="Times New Roman"/>
-                <w:sz w:val="24"/>
-                <w:szCs w:val="24"/>
-                <w:lang w:val="es-EC" w:eastAsia="es-EC"/>
-              </w:rPr>
-            </w:pPr>
-            <w:r>
-              <w:rPr>
-                <w:rFonts w:ascii="Times New Roman" w:eastAsia="Times New Roman" w:hAnsi="Times New Roman"/>
-                <w:sz w:val="24"/>
-                <w:szCs w:val="24"/>
+                <w:rFonts w:asciiTheme="minorHAnsi" w:eastAsia="Times New Roman" w:hAnsiTheme="minorHAnsi" w:cstheme="minorHAnsi"/>
+                <w:lang w:val="es-EC" w:eastAsia="es-EC"/>
+              </w:rPr>
+            </w:pPr>
+            <w:r>
+              <w:rPr>
+                <w:rFonts w:asciiTheme="minorHAnsi" w:eastAsia="Times New Roman" w:hAnsiTheme="minorHAnsi" w:cstheme="minorHAnsi"/>
                 <w:lang w:val="es-EC" w:eastAsia="es-EC"/>
               </w:rPr>
               <w:t>Entrega del servicio</w:t>
@@ -5137,17 +4862,13 @@
               <w:spacing w:after="0" w:line="240" w:lineRule="auto"/>
               <w:jc w:val="center"/>
               <w:rPr>
-                <w:rFonts w:ascii="Times New Roman" w:eastAsia="Times New Roman" w:hAnsi="Times New Roman"/>
-                <w:sz w:val="24"/>
-                <w:szCs w:val="24"/>
-                <w:lang w:val="es-EC" w:eastAsia="es-EC"/>
-              </w:rPr>
-            </w:pPr>
-            <w:r>
-              <w:rPr>
-                <w:rFonts w:ascii="Times New Roman" w:eastAsia="Times New Roman" w:hAnsi="Times New Roman"/>
-                <w:sz w:val="24"/>
-                <w:szCs w:val="24"/>
+                <w:rFonts w:asciiTheme="minorHAnsi" w:eastAsia="Times New Roman" w:hAnsiTheme="minorHAnsi" w:cstheme="minorHAnsi"/>
+                <w:lang w:val="es-EC" w:eastAsia="es-EC"/>
+              </w:rPr>
+            </w:pPr>
+            <w:r>
+              <w:rPr>
+                <w:rFonts w:asciiTheme="minorHAnsi" w:eastAsia="Times New Roman" w:hAnsiTheme="minorHAnsi" w:cstheme="minorHAnsi"/>
                 <w:lang w:val="es-EC" w:eastAsia="es-EC"/>
               </w:rPr>
               <w:t>Servicio completado</w:t>
@@ -5164,17 +4885,13 @@
               <w:spacing w:after="0" w:line="240" w:lineRule="auto"/>
               <w:jc w:val="center"/>
               <w:rPr>
-                <w:rFonts w:ascii="Times New Roman" w:eastAsia="Times New Roman" w:hAnsi="Times New Roman"/>
-                <w:sz w:val="24"/>
-                <w:szCs w:val="24"/>
-                <w:lang w:val="es-EC" w:eastAsia="es-EC"/>
-              </w:rPr>
-            </w:pPr>
-            <w:r>
-              <w:rPr>
-                <w:rFonts w:ascii="Times New Roman" w:eastAsia="Times New Roman" w:hAnsi="Times New Roman"/>
-                <w:sz w:val="24"/>
-                <w:szCs w:val="24"/>
+                <w:rFonts w:asciiTheme="minorHAnsi" w:eastAsia="Times New Roman" w:hAnsiTheme="minorHAnsi" w:cstheme="minorHAnsi"/>
+                <w:lang w:val="es-EC" w:eastAsia="es-EC"/>
+              </w:rPr>
+            </w:pPr>
+            <w:r>
+              <w:rPr>
+                <w:rFonts w:asciiTheme="minorHAnsi" w:eastAsia="Times New Roman" w:hAnsiTheme="minorHAnsi" w:cstheme="minorHAnsi"/>
                 <w:lang w:val="es-EC" w:eastAsia="es-EC"/>
               </w:rPr>
               <w:t>Restaurante</w:t>
@@ -5191,17 +4908,13 @@
               <w:spacing w:after="0" w:line="240" w:lineRule="auto"/>
               <w:jc w:val="center"/>
               <w:rPr>
-                <w:rFonts w:ascii="Times New Roman" w:eastAsia="Times New Roman" w:hAnsi="Times New Roman"/>
-                <w:sz w:val="24"/>
-                <w:szCs w:val="24"/>
-                <w:lang w:val="es-EC" w:eastAsia="es-EC"/>
-              </w:rPr>
-            </w:pPr>
-            <w:r>
-              <w:rPr>
-                <w:rFonts w:ascii="Times New Roman" w:eastAsia="Times New Roman" w:hAnsi="Times New Roman"/>
-                <w:sz w:val="24"/>
-                <w:szCs w:val="24"/>
+                <w:rFonts w:asciiTheme="minorHAnsi" w:eastAsia="Times New Roman" w:hAnsiTheme="minorHAnsi" w:cstheme="minorHAnsi"/>
+                <w:lang w:val="es-EC" w:eastAsia="es-EC"/>
+              </w:rPr>
+            </w:pPr>
+            <w:r>
+              <w:rPr>
+                <w:rFonts w:asciiTheme="minorHAnsi" w:eastAsia="Times New Roman" w:hAnsiTheme="minorHAnsi" w:cstheme="minorHAnsi"/>
                 <w:lang w:val="es-EC" w:eastAsia="es-EC"/>
               </w:rPr>
               <w:t>—</w:t>
@@ -5220,17 +4933,13 @@
               <w:spacing w:after="0" w:line="240" w:lineRule="auto"/>
               <w:jc w:val="center"/>
               <w:rPr>
-                <w:rFonts w:ascii="Times New Roman" w:eastAsia="Times New Roman" w:hAnsi="Times New Roman"/>
-                <w:sz w:val="24"/>
-                <w:szCs w:val="24"/>
-                <w:lang w:val="es-EC" w:eastAsia="es-EC"/>
-              </w:rPr>
-            </w:pPr>
-            <w:r>
-              <w:rPr>
-                <w:rFonts w:ascii="Times New Roman" w:eastAsia="Times New Roman" w:hAnsi="Times New Roman"/>
-                <w:sz w:val="24"/>
-                <w:szCs w:val="24"/>
+                <w:rFonts w:asciiTheme="minorHAnsi" w:eastAsia="Times New Roman" w:hAnsiTheme="minorHAnsi" w:cstheme="minorHAnsi"/>
+                <w:lang w:val="es-EC" w:eastAsia="es-EC"/>
+              </w:rPr>
+            </w:pPr>
+            <w:r>
+              <w:rPr>
+                <w:rFonts w:asciiTheme="minorHAnsi" w:eastAsia="Times New Roman" w:hAnsiTheme="minorHAnsi" w:cstheme="minorHAnsi"/>
                 <w:lang w:val="es-EC" w:eastAsia="es-EC"/>
               </w:rPr>
               <w:t>9</w:t>
@@ -5247,17 +4956,13 @@
               <w:spacing w:after="0" w:line="240" w:lineRule="auto"/>
               <w:jc w:val="center"/>
               <w:rPr>
-                <w:rFonts w:ascii="Times New Roman" w:eastAsia="Times New Roman" w:hAnsi="Times New Roman"/>
-                <w:sz w:val="24"/>
-                <w:szCs w:val="24"/>
-                <w:lang w:val="es-EC" w:eastAsia="es-EC"/>
-              </w:rPr>
-            </w:pPr>
-            <w:r>
-              <w:rPr>
-                <w:rFonts w:ascii="Times New Roman" w:eastAsia="Times New Roman" w:hAnsi="Times New Roman"/>
-                <w:sz w:val="24"/>
-                <w:szCs w:val="24"/>
+                <w:rFonts w:asciiTheme="minorHAnsi" w:eastAsia="Times New Roman" w:hAnsiTheme="minorHAnsi" w:cstheme="minorHAnsi"/>
+                <w:lang w:val="es-EC" w:eastAsia="es-EC"/>
+              </w:rPr>
+            </w:pPr>
+            <w:r>
+              <w:rPr>
+                <w:rFonts w:asciiTheme="minorHAnsi" w:eastAsia="Times New Roman" w:hAnsiTheme="minorHAnsi" w:cstheme="minorHAnsi"/>
                 <w:lang w:val="es-EC" w:eastAsia="es-EC"/>
               </w:rPr>
               <w:t>Rechazar servicio</w:t>
@@ -5274,17 +4979,13 @@
               <w:spacing w:after="0" w:line="240" w:lineRule="auto"/>
               <w:jc w:val="center"/>
               <w:rPr>
-                <w:rFonts w:ascii="Times New Roman" w:eastAsia="Times New Roman" w:hAnsi="Times New Roman"/>
-                <w:sz w:val="24"/>
-                <w:szCs w:val="24"/>
-                <w:lang w:val="es-EC" w:eastAsia="es-EC"/>
-              </w:rPr>
-            </w:pPr>
-            <w:r>
-              <w:rPr>
-                <w:rFonts w:ascii="Times New Roman" w:eastAsia="Times New Roman" w:hAnsi="Times New Roman"/>
-                <w:sz w:val="24"/>
-                <w:szCs w:val="24"/>
+                <w:rFonts w:asciiTheme="minorHAnsi" w:eastAsia="Times New Roman" w:hAnsiTheme="minorHAnsi" w:cstheme="minorHAnsi"/>
+                <w:lang w:val="es-EC" w:eastAsia="es-EC"/>
+              </w:rPr>
+            </w:pPr>
+            <w:r>
+              <w:rPr>
+                <w:rFonts w:asciiTheme="minorHAnsi" w:eastAsia="Times New Roman" w:hAnsiTheme="minorHAnsi" w:cstheme="minorHAnsi"/>
                 <w:lang w:val="es-EC" w:eastAsia="es-EC"/>
               </w:rPr>
               <w:t>En caso de no estar autorizado, se niega el servicio al empleado</w:t>
@@ -5301,17 +5002,13 @@
               <w:spacing w:after="0" w:line="240" w:lineRule="auto"/>
               <w:jc w:val="center"/>
               <w:rPr>
-                <w:rFonts w:ascii="Times New Roman" w:eastAsia="Times New Roman" w:hAnsi="Times New Roman"/>
-                <w:sz w:val="24"/>
-                <w:szCs w:val="24"/>
-                <w:lang w:val="es-EC" w:eastAsia="es-EC"/>
-              </w:rPr>
-            </w:pPr>
-            <w:r>
-              <w:rPr>
-                <w:rFonts w:ascii="Times New Roman" w:eastAsia="Times New Roman" w:hAnsi="Times New Roman"/>
-                <w:sz w:val="24"/>
-                <w:szCs w:val="24"/>
+                <w:rFonts w:asciiTheme="minorHAnsi" w:eastAsia="Times New Roman" w:hAnsiTheme="minorHAnsi" w:cstheme="minorHAnsi"/>
+                <w:lang w:val="es-EC" w:eastAsia="es-EC"/>
+              </w:rPr>
+            </w:pPr>
+            <w:r>
+              <w:rPr>
+                <w:rFonts w:asciiTheme="minorHAnsi" w:eastAsia="Times New Roman" w:hAnsiTheme="minorHAnsi" w:cstheme="minorHAnsi"/>
                 <w:lang w:val="es-EC" w:eastAsia="es-EC"/>
               </w:rPr>
               <w:t>Resultado de validación</w:t>
@@ -5328,17 +5025,13 @@
               <w:spacing w:after="0" w:line="240" w:lineRule="auto"/>
               <w:jc w:val="center"/>
               <w:rPr>
-                <w:rFonts w:ascii="Times New Roman" w:eastAsia="Times New Roman" w:hAnsi="Times New Roman"/>
-                <w:sz w:val="24"/>
-                <w:szCs w:val="24"/>
-                <w:lang w:val="es-EC" w:eastAsia="es-EC"/>
-              </w:rPr>
-            </w:pPr>
-            <w:r>
-              <w:rPr>
-                <w:rFonts w:ascii="Times New Roman" w:eastAsia="Times New Roman" w:hAnsi="Times New Roman"/>
-                <w:sz w:val="24"/>
-                <w:szCs w:val="24"/>
+                <w:rFonts w:asciiTheme="minorHAnsi" w:eastAsia="Times New Roman" w:hAnsiTheme="minorHAnsi" w:cstheme="minorHAnsi"/>
+                <w:lang w:val="es-EC" w:eastAsia="es-EC"/>
+              </w:rPr>
+            </w:pPr>
+            <w:r>
+              <w:rPr>
+                <w:rFonts w:asciiTheme="minorHAnsi" w:eastAsia="Times New Roman" w:hAnsiTheme="minorHAnsi" w:cstheme="minorHAnsi"/>
                 <w:lang w:val="es-EC" w:eastAsia="es-EC"/>
               </w:rPr>
               <w:t>Rechazo del servicio</w:t>
@@ -5355,17 +5048,13 @@
               <w:spacing w:after="0" w:line="240" w:lineRule="auto"/>
               <w:jc w:val="center"/>
               <w:rPr>
-                <w:rFonts w:ascii="Times New Roman" w:eastAsia="Times New Roman" w:hAnsi="Times New Roman"/>
-                <w:sz w:val="24"/>
-                <w:szCs w:val="24"/>
-                <w:lang w:val="es-EC" w:eastAsia="es-EC"/>
-              </w:rPr>
-            </w:pPr>
-            <w:r>
-              <w:rPr>
-                <w:rFonts w:ascii="Times New Roman" w:eastAsia="Times New Roman" w:hAnsi="Times New Roman"/>
-                <w:sz w:val="24"/>
-                <w:szCs w:val="24"/>
+                <w:rFonts w:asciiTheme="minorHAnsi" w:eastAsia="Times New Roman" w:hAnsiTheme="minorHAnsi" w:cstheme="minorHAnsi"/>
+                <w:lang w:val="es-EC" w:eastAsia="es-EC"/>
+              </w:rPr>
+            </w:pPr>
+            <w:r>
+              <w:rPr>
+                <w:rFonts w:asciiTheme="minorHAnsi" w:eastAsia="Times New Roman" w:hAnsiTheme="minorHAnsi" w:cstheme="minorHAnsi"/>
                 <w:lang w:val="es-EC" w:eastAsia="es-EC"/>
               </w:rPr>
               <w:t>Servicio no prestado</w:t>
@@ -5382,17 +5071,13 @@
               <w:spacing w:after="0" w:line="240" w:lineRule="auto"/>
               <w:jc w:val="center"/>
               <w:rPr>
-                <w:rFonts w:ascii="Times New Roman" w:eastAsia="Times New Roman" w:hAnsi="Times New Roman"/>
-                <w:sz w:val="24"/>
-                <w:szCs w:val="24"/>
-                <w:lang w:val="es-EC" w:eastAsia="es-EC"/>
-              </w:rPr>
-            </w:pPr>
-            <w:r>
-              <w:rPr>
-                <w:rFonts w:ascii="Times New Roman" w:eastAsia="Times New Roman" w:hAnsi="Times New Roman"/>
-                <w:sz w:val="24"/>
-                <w:szCs w:val="24"/>
+                <w:rFonts w:asciiTheme="minorHAnsi" w:eastAsia="Times New Roman" w:hAnsiTheme="minorHAnsi" w:cstheme="minorHAnsi"/>
+                <w:lang w:val="es-EC" w:eastAsia="es-EC"/>
+              </w:rPr>
+            </w:pPr>
+            <w:r>
+              <w:rPr>
+                <w:rFonts w:asciiTheme="minorHAnsi" w:eastAsia="Times New Roman" w:hAnsiTheme="minorHAnsi" w:cstheme="minorHAnsi"/>
                 <w:lang w:val="es-EC" w:eastAsia="es-EC"/>
               </w:rPr>
               <w:t>Restaurante</w:t>
@@ -5409,17 +5094,13 @@
               <w:spacing w:after="0" w:line="240" w:lineRule="auto"/>
               <w:jc w:val="center"/>
               <w:rPr>
-                <w:rFonts w:ascii="Times New Roman" w:eastAsia="Times New Roman" w:hAnsi="Times New Roman"/>
-                <w:sz w:val="24"/>
-                <w:szCs w:val="24"/>
-                <w:lang w:val="es-EC" w:eastAsia="es-EC"/>
-              </w:rPr>
-            </w:pPr>
-            <w:r>
-              <w:rPr>
-                <w:rFonts w:ascii="Times New Roman" w:eastAsia="Times New Roman" w:hAnsi="Times New Roman"/>
-                <w:sz w:val="24"/>
-                <w:szCs w:val="24"/>
+                <w:rFonts w:asciiTheme="minorHAnsi" w:eastAsia="Times New Roman" w:hAnsiTheme="minorHAnsi" w:cstheme="minorHAnsi"/>
+                <w:lang w:val="es-EC" w:eastAsia="es-EC"/>
+              </w:rPr>
+            </w:pPr>
+            <w:r>
+              <w:rPr>
+                <w:rFonts w:asciiTheme="minorHAnsi" w:eastAsia="Times New Roman" w:hAnsiTheme="minorHAnsi" w:cstheme="minorHAnsi"/>
                 <w:lang w:val="es-EC" w:eastAsia="es-EC"/>
               </w:rPr>
               <w:t>—</w:t>
@@ -5438,17 +5119,13 @@
               <w:spacing w:after="0" w:line="240" w:lineRule="auto"/>
               <w:jc w:val="center"/>
               <w:rPr>
-                <w:rFonts w:ascii="Times New Roman" w:eastAsia="Times New Roman" w:hAnsi="Times New Roman"/>
-                <w:sz w:val="24"/>
-                <w:szCs w:val="24"/>
-                <w:lang w:val="es-EC" w:eastAsia="es-EC"/>
-              </w:rPr>
-            </w:pPr>
-            <w:r>
-              <w:rPr>
-                <w:rFonts w:ascii="Times New Roman" w:eastAsia="Times New Roman" w:hAnsi="Times New Roman"/>
-                <w:sz w:val="24"/>
-                <w:szCs w:val="24"/>
+                <w:rFonts w:asciiTheme="minorHAnsi" w:eastAsia="Times New Roman" w:hAnsiTheme="minorHAnsi" w:cstheme="minorHAnsi"/>
+                <w:lang w:val="es-EC" w:eastAsia="es-EC"/>
+              </w:rPr>
+            </w:pPr>
+            <w:r>
+              <w:rPr>
+                <w:rFonts w:asciiTheme="minorHAnsi" w:eastAsia="Times New Roman" w:hAnsiTheme="minorHAnsi" w:cstheme="minorHAnsi"/>
                 <w:lang w:val="es-EC" w:eastAsia="es-EC"/>
               </w:rPr>
               <w:t>10</w:t>
@@ -5465,17 +5142,13 @@
               <w:spacing w:after="0" w:line="240" w:lineRule="auto"/>
               <w:jc w:val="center"/>
               <w:rPr>
-                <w:rFonts w:ascii="Times New Roman" w:eastAsia="Times New Roman" w:hAnsi="Times New Roman"/>
-                <w:sz w:val="24"/>
-                <w:szCs w:val="24"/>
-                <w:lang w:val="es-EC" w:eastAsia="es-EC"/>
-              </w:rPr>
-            </w:pPr>
-            <w:r>
-              <w:rPr>
-                <w:rFonts w:ascii="Times New Roman" w:eastAsia="Times New Roman" w:hAnsi="Times New Roman"/>
-                <w:sz w:val="24"/>
-                <w:szCs w:val="24"/>
+                <w:rFonts w:asciiTheme="minorHAnsi" w:eastAsia="Times New Roman" w:hAnsiTheme="minorHAnsi" w:cstheme="minorHAnsi"/>
+                <w:lang w:val="es-EC" w:eastAsia="es-EC"/>
+              </w:rPr>
+            </w:pPr>
+            <w:r>
+              <w:rPr>
+                <w:rFonts w:asciiTheme="minorHAnsi" w:eastAsia="Times New Roman" w:hAnsiTheme="minorHAnsi" w:cstheme="minorHAnsi"/>
                 <w:lang w:val="es-EC" w:eastAsia="es-EC"/>
               </w:rPr>
               <w:t>Recibir reportes del restaurante</w:t>
@@ -5492,17 +5165,13 @@
               <w:spacing w:after="0" w:line="240" w:lineRule="auto"/>
               <w:jc w:val="center"/>
               <w:rPr>
-                <w:rFonts w:ascii="Times New Roman" w:eastAsia="Times New Roman" w:hAnsi="Times New Roman"/>
-                <w:sz w:val="24"/>
-                <w:szCs w:val="24"/>
-                <w:lang w:val="es-EC" w:eastAsia="es-EC"/>
-              </w:rPr>
-            </w:pPr>
-            <w:r>
-              <w:rPr>
-                <w:rFonts w:ascii="Times New Roman" w:eastAsia="Times New Roman" w:hAnsi="Times New Roman"/>
-                <w:sz w:val="24"/>
-                <w:szCs w:val="24"/>
+                <w:rFonts w:asciiTheme="minorHAnsi" w:eastAsia="Times New Roman" w:hAnsiTheme="minorHAnsi" w:cstheme="minorHAnsi"/>
+                <w:lang w:val="es-EC" w:eastAsia="es-EC"/>
+              </w:rPr>
+            </w:pPr>
+            <w:r>
+              <w:rPr>
+                <w:rFonts w:asciiTheme="minorHAnsi" w:eastAsia="Times New Roman" w:hAnsiTheme="minorHAnsi" w:cstheme="minorHAnsi"/>
                 <w:lang w:val="es-EC" w:eastAsia="es-EC"/>
               </w:rPr>
               <w:t>La empresa recibe los reportes de consumos realizados</w:t>
@@ -5519,17 +5188,13 @@
               <w:spacing w:after="0" w:line="240" w:lineRule="auto"/>
               <w:jc w:val="center"/>
               <w:rPr>
-                <w:rFonts w:ascii="Times New Roman" w:eastAsia="Times New Roman" w:hAnsi="Times New Roman"/>
-                <w:sz w:val="24"/>
-                <w:szCs w:val="24"/>
-                <w:lang w:val="es-EC" w:eastAsia="es-EC"/>
-              </w:rPr>
-            </w:pPr>
-            <w:r>
-              <w:rPr>
-                <w:rFonts w:ascii="Times New Roman" w:eastAsia="Times New Roman" w:hAnsi="Times New Roman"/>
-                <w:sz w:val="24"/>
-                <w:szCs w:val="24"/>
+                <w:rFonts w:asciiTheme="minorHAnsi" w:eastAsia="Times New Roman" w:hAnsiTheme="minorHAnsi" w:cstheme="minorHAnsi"/>
+                <w:lang w:val="es-EC" w:eastAsia="es-EC"/>
+              </w:rPr>
+            </w:pPr>
+            <w:r>
+              <w:rPr>
+                <w:rFonts w:asciiTheme="minorHAnsi" w:eastAsia="Times New Roman" w:hAnsiTheme="minorHAnsi" w:cstheme="minorHAnsi"/>
                 <w:lang w:val="es-EC" w:eastAsia="es-EC"/>
               </w:rPr>
               <w:t>Reportes de consumo</w:t>
@@ -5546,17 +5211,13 @@
               <w:spacing w:after="0" w:line="240" w:lineRule="auto"/>
               <w:jc w:val="center"/>
               <w:rPr>
-                <w:rFonts w:ascii="Times New Roman" w:eastAsia="Times New Roman" w:hAnsi="Times New Roman"/>
-                <w:sz w:val="24"/>
-                <w:szCs w:val="24"/>
-                <w:lang w:val="es-EC" w:eastAsia="es-EC"/>
-              </w:rPr>
-            </w:pPr>
-            <w:r>
-              <w:rPr>
-                <w:rFonts w:ascii="Times New Roman" w:eastAsia="Times New Roman" w:hAnsi="Times New Roman"/>
-                <w:sz w:val="24"/>
-                <w:szCs w:val="24"/>
+                <w:rFonts w:asciiTheme="minorHAnsi" w:eastAsia="Times New Roman" w:hAnsiTheme="minorHAnsi" w:cstheme="minorHAnsi"/>
+                <w:lang w:val="es-EC" w:eastAsia="es-EC"/>
+              </w:rPr>
+            </w:pPr>
+            <w:r>
+              <w:rPr>
+                <w:rFonts w:asciiTheme="minorHAnsi" w:eastAsia="Times New Roman" w:hAnsiTheme="minorHAnsi" w:cstheme="minorHAnsi"/>
                 <w:lang w:val="es-EC" w:eastAsia="es-EC"/>
               </w:rPr>
               <w:t>Recepción de información</w:t>
@@ -5573,17 +5234,13 @@
               <w:spacing w:after="0" w:line="240" w:lineRule="auto"/>
               <w:jc w:val="center"/>
               <w:rPr>
-                <w:rFonts w:ascii="Times New Roman" w:eastAsia="Times New Roman" w:hAnsi="Times New Roman"/>
-                <w:sz w:val="24"/>
-                <w:szCs w:val="24"/>
-                <w:lang w:val="es-EC" w:eastAsia="es-EC"/>
-              </w:rPr>
-            </w:pPr>
-            <w:r>
-              <w:rPr>
-                <w:rFonts w:ascii="Times New Roman" w:eastAsia="Times New Roman" w:hAnsi="Times New Roman"/>
-                <w:sz w:val="24"/>
-                <w:szCs w:val="24"/>
+                <w:rFonts w:asciiTheme="minorHAnsi" w:eastAsia="Times New Roman" w:hAnsiTheme="minorHAnsi" w:cstheme="minorHAnsi"/>
+                <w:lang w:val="es-EC" w:eastAsia="es-EC"/>
+              </w:rPr>
+            </w:pPr>
+            <w:r>
+              <w:rPr>
+                <w:rFonts w:asciiTheme="minorHAnsi" w:eastAsia="Times New Roman" w:hAnsiTheme="minorHAnsi" w:cstheme="minorHAnsi"/>
                 <w:lang w:val="es-EC" w:eastAsia="es-EC"/>
               </w:rPr>
               <w:t>Reportes disponibles</w:t>
@@ -5600,17 +5257,13 @@
               <w:spacing w:after="0" w:line="240" w:lineRule="auto"/>
               <w:jc w:val="center"/>
               <w:rPr>
-                <w:rFonts w:ascii="Times New Roman" w:eastAsia="Times New Roman" w:hAnsi="Times New Roman"/>
-                <w:sz w:val="24"/>
-                <w:szCs w:val="24"/>
-                <w:lang w:val="es-EC" w:eastAsia="es-EC"/>
-              </w:rPr>
-            </w:pPr>
-            <w:r>
-              <w:rPr>
-                <w:rFonts w:ascii="Times New Roman" w:eastAsia="Times New Roman" w:hAnsi="Times New Roman"/>
-                <w:sz w:val="24"/>
-                <w:szCs w:val="24"/>
+                <w:rFonts w:asciiTheme="minorHAnsi" w:eastAsia="Times New Roman" w:hAnsiTheme="minorHAnsi" w:cstheme="minorHAnsi"/>
+                <w:lang w:val="es-EC" w:eastAsia="es-EC"/>
+              </w:rPr>
+            </w:pPr>
+            <w:r>
+              <w:rPr>
+                <w:rFonts w:asciiTheme="minorHAnsi" w:eastAsia="Times New Roman" w:hAnsiTheme="minorHAnsi" w:cstheme="minorHAnsi"/>
                 <w:lang w:val="es-EC" w:eastAsia="es-EC"/>
               </w:rPr>
               <w:t>Empresa</w:t>
@@ -5627,17 +5280,13 @@
               <w:spacing w:after="0" w:line="240" w:lineRule="auto"/>
               <w:jc w:val="center"/>
               <w:rPr>
-                <w:rFonts w:ascii="Times New Roman" w:eastAsia="Times New Roman" w:hAnsi="Times New Roman"/>
-                <w:sz w:val="24"/>
-                <w:szCs w:val="24"/>
-                <w:lang w:val="es-EC" w:eastAsia="es-EC"/>
-              </w:rPr>
-            </w:pPr>
-            <w:r>
-              <w:rPr>
-                <w:rFonts w:ascii="Times New Roman" w:eastAsia="Times New Roman" w:hAnsi="Times New Roman"/>
-                <w:sz w:val="24"/>
-                <w:szCs w:val="24"/>
+                <w:rFonts w:asciiTheme="minorHAnsi" w:eastAsia="Times New Roman" w:hAnsiTheme="minorHAnsi" w:cstheme="minorHAnsi"/>
+                <w:lang w:val="es-EC" w:eastAsia="es-EC"/>
+              </w:rPr>
+            </w:pPr>
+            <w:r>
+              <w:rPr>
+                <w:rFonts w:asciiTheme="minorHAnsi" w:eastAsia="Times New Roman" w:hAnsiTheme="minorHAnsi" w:cstheme="minorHAnsi"/>
                 <w:lang w:val="es-EC" w:eastAsia="es-EC"/>
               </w:rPr>
               <w:t>Reporte</w:t>
@@ -5656,17 +5305,13 @@
               <w:spacing w:after="0" w:line="240" w:lineRule="auto"/>
               <w:jc w:val="center"/>
               <w:rPr>
-                <w:rFonts w:ascii="Times New Roman" w:eastAsia="Times New Roman" w:hAnsi="Times New Roman"/>
-                <w:sz w:val="24"/>
-                <w:szCs w:val="24"/>
-                <w:lang w:val="es-EC" w:eastAsia="es-EC"/>
-              </w:rPr>
-            </w:pPr>
-            <w:r>
-              <w:rPr>
-                <w:rFonts w:ascii="Times New Roman" w:eastAsia="Times New Roman" w:hAnsi="Times New Roman"/>
-                <w:sz w:val="24"/>
-                <w:szCs w:val="24"/>
+                <w:rFonts w:asciiTheme="minorHAnsi" w:eastAsia="Times New Roman" w:hAnsiTheme="minorHAnsi" w:cstheme="minorHAnsi"/>
+                <w:lang w:val="es-EC" w:eastAsia="es-EC"/>
+              </w:rPr>
+            </w:pPr>
+            <w:r>
+              <w:rPr>
+                <w:rFonts w:asciiTheme="minorHAnsi" w:eastAsia="Times New Roman" w:hAnsiTheme="minorHAnsi" w:cstheme="minorHAnsi"/>
                 <w:lang w:val="es-EC" w:eastAsia="es-EC"/>
               </w:rPr>
               <w:t>11</w:t>
@@ -5683,17 +5328,13 @@
               <w:spacing w:after="0" w:line="240" w:lineRule="auto"/>
               <w:jc w:val="center"/>
               <w:rPr>
-                <w:rFonts w:ascii="Times New Roman" w:eastAsia="Times New Roman" w:hAnsi="Times New Roman"/>
-                <w:sz w:val="24"/>
-                <w:szCs w:val="24"/>
-                <w:lang w:val="es-EC" w:eastAsia="es-EC"/>
-              </w:rPr>
-            </w:pPr>
-            <w:r>
-              <w:rPr>
-                <w:rFonts w:ascii="Times New Roman" w:eastAsia="Times New Roman" w:hAnsi="Times New Roman"/>
-                <w:sz w:val="24"/>
-                <w:szCs w:val="24"/>
+                <w:rFonts w:asciiTheme="minorHAnsi" w:eastAsia="Times New Roman" w:hAnsiTheme="minorHAnsi" w:cstheme="minorHAnsi"/>
+                <w:lang w:val="es-EC" w:eastAsia="es-EC"/>
+              </w:rPr>
+            </w:pPr>
+            <w:r>
+              <w:rPr>
+                <w:rFonts w:asciiTheme="minorHAnsi" w:eastAsia="Times New Roman" w:hAnsiTheme="minorHAnsi" w:cstheme="minorHAnsi"/>
                 <w:lang w:val="es-EC" w:eastAsia="es-EC"/>
               </w:rPr>
               <w:t>Validar consumos</w:t>
@@ -5710,30 +5351,16 @@
               <w:spacing w:after="0" w:line="240" w:lineRule="auto"/>
               <w:jc w:val="center"/>
               <w:rPr>
-                <w:rFonts w:ascii="Times New Roman" w:eastAsia="Times New Roman" w:hAnsi="Times New Roman"/>
-                <w:sz w:val="24"/>
-                <w:szCs w:val="24"/>
-                <w:lang w:val="es-EC" w:eastAsia="es-EC"/>
-              </w:rPr>
-            </w:pPr>
-            <w:r>
-              <w:rPr>
-                <w:rFonts w:ascii="Times New Roman" w:eastAsia="Times New Roman" w:hAnsi="Times New Roman"/>
-                <w:sz w:val="24"/>
-                <w:szCs w:val="24"/>
-                <w:lang w:val="es-EC" w:eastAsia="es-EC"/>
-              </w:rPr>
-              <w:t xml:space="preserve">La empresa revisa y valida </w:t>
-            </w:r>
-            <w:r>
-              <w:rPr>
-                <w:rFonts w:ascii="Times New Roman" w:eastAsia="Times New Roman" w:hAnsi="Times New Roman"/>
-                <w:sz w:val="24"/>
-                <w:szCs w:val="24"/>
-                <w:lang w:val="es-EC" w:eastAsia="es-EC"/>
-              </w:rPr>
-              <w:lastRenderedPageBreak/>
-              <w:t>los consumos reportados</w:t>
+                <w:rFonts w:asciiTheme="minorHAnsi" w:eastAsia="Times New Roman" w:hAnsiTheme="minorHAnsi" w:cstheme="minorHAnsi"/>
+                <w:lang w:val="es-EC" w:eastAsia="es-EC"/>
+              </w:rPr>
+            </w:pPr>
+            <w:r>
+              <w:rPr>
+                <w:rFonts w:asciiTheme="minorHAnsi" w:eastAsia="Times New Roman" w:hAnsiTheme="minorHAnsi" w:cstheme="minorHAnsi"/>
+                <w:lang w:val="es-EC" w:eastAsia="es-EC"/>
+              </w:rPr>
+              <w:t>La empresa revisa y valida los consumos reportados</w:t>
             </w:r>
           </w:p>
         </w:tc>
@@ -5747,20 +5374,15 @@
               <w:spacing w:after="0" w:line="240" w:lineRule="auto"/>
               <w:jc w:val="center"/>
               <w:rPr>
-                <w:rFonts w:ascii="Times New Roman" w:eastAsia="Times New Roman" w:hAnsi="Times New Roman"/>
-                <w:sz w:val="24"/>
-                <w:szCs w:val="24"/>
-                <w:lang w:val="es-EC" w:eastAsia="es-EC"/>
-              </w:rPr>
-            </w:pPr>
-            <w:r>
-              <w:rPr>
-                <w:rFonts w:ascii="Times New Roman" w:eastAsia="Times New Roman" w:hAnsi="Times New Roman"/>
-                <w:sz w:val="24"/>
-                <w:szCs w:val="24"/>
-                <w:lang w:val="es-EC" w:eastAsia="es-EC"/>
-              </w:rPr>
-              <w:lastRenderedPageBreak/>
+                <w:rFonts w:asciiTheme="minorHAnsi" w:eastAsia="Times New Roman" w:hAnsiTheme="minorHAnsi" w:cstheme="minorHAnsi"/>
+                <w:lang w:val="es-EC" w:eastAsia="es-EC"/>
+              </w:rPr>
+            </w:pPr>
+            <w:r>
+              <w:rPr>
+                <w:rFonts w:asciiTheme="minorHAnsi" w:eastAsia="Times New Roman" w:hAnsiTheme="minorHAnsi" w:cstheme="minorHAnsi"/>
+                <w:lang w:val="es-EC" w:eastAsia="es-EC"/>
+              </w:rPr>
               <w:t>Reportes</w:t>
             </w:r>
           </w:p>
@@ -5775,17 +5397,13 @@
               <w:spacing w:after="0" w:line="240" w:lineRule="auto"/>
               <w:jc w:val="center"/>
               <w:rPr>
-                <w:rFonts w:ascii="Times New Roman" w:eastAsia="Times New Roman" w:hAnsi="Times New Roman"/>
-                <w:sz w:val="24"/>
-                <w:szCs w:val="24"/>
-                <w:lang w:val="es-EC" w:eastAsia="es-EC"/>
-              </w:rPr>
-            </w:pPr>
-            <w:r>
-              <w:rPr>
-                <w:rFonts w:ascii="Times New Roman" w:eastAsia="Times New Roman" w:hAnsi="Times New Roman"/>
-                <w:sz w:val="24"/>
-                <w:szCs w:val="24"/>
+                <w:rFonts w:asciiTheme="minorHAnsi" w:eastAsia="Times New Roman" w:hAnsiTheme="minorHAnsi" w:cstheme="minorHAnsi"/>
+                <w:lang w:val="es-EC" w:eastAsia="es-EC"/>
+              </w:rPr>
+            </w:pPr>
+            <w:r>
+              <w:rPr>
+                <w:rFonts w:asciiTheme="minorHAnsi" w:eastAsia="Times New Roman" w:hAnsiTheme="minorHAnsi" w:cstheme="minorHAnsi"/>
                 <w:lang w:val="es-EC" w:eastAsia="es-EC"/>
               </w:rPr>
               <w:t>Verificación de información</w:t>
@@ -5802,17 +5420,13 @@
               <w:spacing w:after="0" w:line="240" w:lineRule="auto"/>
               <w:jc w:val="center"/>
               <w:rPr>
-                <w:rFonts w:ascii="Times New Roman" w:eastAsia="Times New Roman" w:hAnsi="Times New Roman"/>
-                <w:sz w:val="24"/>
-                <w:szCs w:val="24"/>
-                <w:lang w:val="es-EC" w:eastAsia="es-EC"/>
-              </w:rPr>
-            </w:pPr>
-            <w:r>
-              <w:rPr>
-                <w:rFonts w:ascii="Times New Roman" w:eastAsia="Times New Roman" w:hAnsi="Times New Roman"/>
-                <w:sz w:val="24"/>
-                <w:szCs w:val="24"/>
+                <w:rFonts w:asciiTheme="minorHAnsi" w:eastAsia="Times New Roman" w:hAnsiTheme="minorHAnsi" w:cstheme="minorHAnsi"/>
+                <w:lang w:val="es-EC" w:eastAsia="es-EC"/>
+              </w:rPr>
+            </w:pPr>
+            <w:r>
+              <w:rPr>
+                <w:rFonts w:asciiTheme="minorHAnsi" w:eastAsia="Times New Roman" w:hAnsiTheme="minorHAnsi" w:cstheme="minorHAnsi"/>
                 <w:lang w:val="es-EC" w:eastAsia="es-EC"/>
               </w:rPr>
               <w:t>Consumos validados</w:t>
@@ -5829,17 +5443,13 @@
               <w:spacing w:after="0" w:line="240" w:lineRule="auto"/>
               <w:jc w:val="center"/>
               <w:rPr>
-                <w:rFonts w:ascii="Times New Roman" w:eastAsia="Times New Roman" w:hAnsi="Times New Roman"/>
-                <w:sz w:val="24"/>
-                <w:szCs w:val="24"/>
-                <w:lang w:val="es-EC" w:eastAsia="es-EC"/>
-              </w:rPr>
-            </w:pPr>
-            <w:r>
-              <w:rPr>
-                <w:rFonts w:ascii="Times New Roman" w:eastAsia="Times New Roman" w:hAnsi="Times New Roman"/>
-                <w:sz w:val="24"/>
-                <w:szCs w:val="24"/>
+                <w:rFonts w:asciiTheme="minorHAnsi" w:eastAsia="Times New Roman" w:hAnsiTheme="minorHAnsi" w:cstheme="minorHAnsi"/>
+                <w:lang w:val="es-EC" w:eastAsia="es-EC"/>
+              </w:rPr>
+            </w:pPr>
+            <w:r>
+              <w:rPr>
+                <w:rFonts w:asciiTheme="minorHAnsi" w:eastAsia="Times New Roman" w:hAnsiTheme="minorHAnsi" w:cstheme="minorHAnsi"/>
                 <w:lang w:val="es-EC" w:eastAsia="es-EC"/>
               </w:rPr>
               <w:t>Empresa</w:t>
@@ -5856,17 +5466,13 @@
               <w:spacing w:after="0" w:line="240" w:lineRule="auto"/>
               <w:jc w:val="center"/>
               <w:rPr>
-                <w:rFonts w:ascii="Times New Roman" w:eastAsia="Times New Roman" w:hAnsi="Times New Roman"/>
-                <w:sz w:val="24"/>
-                <w:szCs w:val="24"/>
-                <w:lang w:val="es-EC" w:eastAsia="es-EC"/>
-              </w:rPr>
-            </w:pPr>
-            <w:r>
-              <w:rPr>
-                <w:rFonts w:ascii="Times New Roman" w:eastAsia="Times New Roman" w:hAnsi="Times New Roman"/>
-                <w:sz w:val="24"/>
-                <w:szCs w:val="24"/>
+                <w:rFonts w:asciiTheme="minorHAnsi" w:eastAsia="Times New Roman" w:hAnsiTheme="minorHAnsi" w:cstheme="minorHAnsi"/>
+                <w:lang w:val="es-EC" w:eastAsia="es-EC"/>
+              </w:rPr>
+            </w:pPr>
+            <w:r>
+              <w:rPr>
+                <w:rFonts w:asciiTheme="minorHAnsi" w:eastAsia="Times New Roman" w:hAnsiTheme="minorHAnsi" w:cstheme="minorHAnsi"/>
                 <w:lang w:val="es-EC" w:eastAsia="es-EC"/>
               </w:rPr>
               <w:t>Reporte validado</w:t>
@@ -5885,17 +5491,13 @@
               <w:spacing w:after="0" w:line="240" w:lineRule="auto"/>
               <w:jc w:val="center"/>
               <w:rPr>
-                <w:rFonts w:ascii="Times New Roman" w:eastAsia="Times New Roman" w:hAnsi="Times New Roman"/>
-                <w:sz w:val="24"/>
-                <w:szCs w:val="24"/>
-                <w:lang w:val="es-EC" w:eastAsia="es-EC"/>
-              </w:rPr>
-            </w:pPr>
-            <w:r>
-              <w:rPr>
-                <w:rFonts w:ascii="Times New Roman" w:eastAsia="Times New Roman" w:hAnsi="Times New Roman"/>
-                <w:sz w:val="24"/>
-                <w:szCs w:val="24"/>
+                <w:rFonts w:asciiTheme="minorHAnsi" w:eastAsia="Times New Roman" w:hAnsiTheme="minorHAnsi" w:cstheme="minorHAnsi"/>
+                <w:lang w:val="es-EC" w:eastAsia="es-EC"/>
+              </w:rPr>
+            </w:pPr>
+            <w:r>
+              <w:rPr>
+                <w:rFonts w:asciiTheme="minorHAnsi" w:eastAsia="Times New Roman" w:hAnsiTheme="minorHAnsi" w:cstheme="minorHAnsi"/>
                 <w:lang w:val="es-EC" w:eastAsia="es-EC"/>
               </w:rPr>
               <w:t>12</w:t>
@@ -5912,17 +5514,13 @@
               <w:spacing w:after="0" w:line="240" w:lineRule="auto"/>
               <w:jc w:val="center"/>
               <w:rPr>
-                <w:rFonts w:ascii="Times New Roman" w:eastAsia="Times New Roman" w:hAnsi="Times New Roman"/>
-                <w:sz w:val="24"/>
-                <w:szCs w:val="24"/>
-                <w:lang w:val="es-EC" w:eastAsia="es-EC"/>
-              </w:rPr>
-            </w:pPr>
-            <w:r>
-              <w:rPr>
-                <w:rFonts w:ascii="Times New Roman" w:eastAsia="Times New Roman" w:hAnsi="Times New Roman"/>
-                <w:sz w:val="24"/>
-                <w:szCs w:val="24"/>
+                <w:rFonts w:asciiTheme="minorHAnsi" w:eastAsia="Times New Roman" w:hAnsiTheme="minorHAnsi" w:cstheme="minorHAnsi"/>
+                <w:lang w:val="es-EC" w:eastAsia="es-EC"/>
+              </w:rPr>
+            </w:pPr>
+            <w:r>
+              <w:rPr>
+                <w:rFonts w:asciiTheme="minorHAnsi" w:eastAsia="Times New Roman" w:hAnsiTheme="minorHAnsi" w:cstheme="minorHAnsi"/>
                 <w:lang w:val="es-EC" w:eastAsia="es-EC"/>
               </w:rPr>
               <w:t>Realizar pagos al restaurante</w:t>
@@ -5939,17 +5537,13 @@
               <w:spacing w:after="0" w:line="240" w:lineRule="auto"/>
               <w:jc w:val="center"/>
               <w:rPr>
-                <w:rFonts w:ascii="Times New Roman" w:eastAsia="Times New Roman" w:hAnsi="Times New Roman"/>
-                <w:sz w:val="24"/>
-                <w:szCs w:val="24"/>
-                <w:lang w:val="es-EC" w:eastAsia="es-EC"/>
-              </w:rPr>
-            </w:pPr>
-            <w:r>
-              <w:rPr>
-                <w:rFonts w:ascii="Times New Roman" w:eastAsia="Times New Roman" w:hAnsi="Times New Roman"/>
-                <w:sz w:val="24"/>
-                <w:szCs w:val="24"/>
+                <w:rFonts w:asciiTheme="minorHAnsi" w:eastAsia="Times New Roman" w:hAnsiTheme="minorHAnsi" w:cstheme="minorHAnsi"/>
+                <w:lang w:val="es-EC" w:eastAsia="es-EC"/>
+              </w:rPr>
+            </w:pPr>
+            <w:r>
+              <w:rPr>
+                <w:rFonts w:asciiTheme="minorHAnsi" w:eastAsia="Times New Roman" w:hAnsiTheme="minorHAnsi" w:cstheme="minorHAnsi"/>
                 <w:lang w:val="es-EC" w:eastAsia="es-EC"/>
               </w:rPr>
               <w:t>La empresa realiza el pago por los servicios prestados</w:t>
@@ -5966,17 +5560,13 @@
               <w:spacing w:after="0" w:line="240" w:lineRule="auto"/>
               <w:jc w:val="center"/>
               <w:rPr>
-                <w:rFonts w:ascii="Times New Roman" w:eastAsia="Times New Roman" w:hAnsi="Times New Roman"/>
-                <w:sz w:val="24"/>
-                <w:szCs w:val="24"/>
-                <w:lang w:val="es-EC" w:eastAsia="es-EC"/>
-              </w:rPr>
-            </w:pPr>
-            <w:r>
-              <w:rPr>
-                <w:rFonts w:ascii="Times New Roman" w:eastAsia="Times New Roman" w:hAnsi="Times New Roman"/>
-                <w:sz w:val="24"/>
-                <w:szCs w:val="24"/>
+                <w:rFonts w:asciiTheme="minorHAnsi" w:eastAsia="Times New Roman" w:hAnsiTheme="minorHAnsi" w:cstheme="minorHAnsi"/>
+                <w:lang w:val="es-EC" w:eastAsia="es-EC"/>
+              </w:rPr>
+            </w:pPr>
+            <w:r>
+              <w:rPr>
+                <w:rFonts w:asciiTheme="minorHAnsi" w:eastAsia="Times New Roman" w:hAnsiTheme="minorHAnsi" w:cstheme="minorHAnsi"/>
                 <w:lang w:val="es-EC" w:eastAsia="es-EC"/>
               </w:rPr>
               <w:t>Consumos validados</w:t>
@@ -5993,17 +5583,13 @@
               <w:spacing w:after="0" w:line="240" w:lineRule="auto"/>
               <w:jc w:val="center"/>
               <w:rPr>
-                <w:rFonts w:ascii="Times New Roman" w:eastAsia="Times New Roman" w:hAnsi="Times New Roman"/>
-                <w:sz w:val="24"/>
-                <w:szCs w:val="24"/>
-                <w:lang w:val="es-EC" w:eastAsia="es-EC"/>
-              </w:rPr>
-            </w:pPr>
-            <w:r>
-              <w:rPr>
-                <w:rFonts w:ascii="Times New Roman" w:eastAsia="Times New Roman" w:hAnsi="Times New Roman"/>
-                <w:sz w:val="24"/>
-                <w:szCs w:val="24"/>
+                <w:rFonts w:asciiTheme="minorHAnsi" w:eastAsia="Times New Roman" w:hAnsiTheme="minorHAnsi" w:cstheme="minorHAnsi"/>
+                <w:lang w:val="es-EC" w:eastAsia="es-EC"/>
+              </w:rPr>
+            </w:pPr>
+            <w:r>
+              <w:rPr>
+                <w:rFonts w:asciiTheme="minorHAnsi" w:eastAsia="Times New Roman" w:hAnsiTheme="minorHAnsi" w:cstheme="minorHAnsi"/>
                 <w:lang w:val="es-EC" w:eastAsia="es-EC"/>
               </w:rPr>
               <w:t>Procesamiento de pago</w:t>
@@ -6020,17 +5606,13 @@
               <w:spacing w:after="0" w:line="240" w:lineRule="auto"/>
               <w:jc w:val="center"/>
               <w:rPr>
-                <w:rFonts w:ascii="Times New Roman" w:eastAsia="Times New Roman" w:hAnsi="Times New Roman"/>
-                <w:sz w:val="24"/>
-                <w:szCs w:val="24"/>
-                <w:lang w:val="es-EC" w:eastAsia="es-EC"/>
-              </w:rPr>
-            </w:pPr>
-            <w:r>
-              <w:rPr>
-                <w:rFonts w:ascii="Times New Roman" w:eastAsia="Times New Roman" w:hAnsi="Times New Roman"/>
-                <w:sz w:val="24"/>
-                <w:szCs w:val="24"/>
+                <w:rFonts w:asciiTheme="minorHAnsi" w:eastAsia="Times New Roman" w:hAnsiTheme="minorHAnsi" w:cstheme="minorHAnsi"/>
+                <w:lang w:val="es-EC" w:eastAsia="es-EC"/>
+              </w:rPr>
+            </w:pPr>
+            <w:r>
+              <w:rPr>
+                <w:rFonts w:asciiTheme="minorHAnsi" w:eastAsia="Times New Roman" w:hAnsiTheme="minorHAnsi" w:cstheme="minorHAnsi"/>
                 <w:lang w:val="es-EC" w:eastAsia="es-EC"/>
               </w:rPr>
               <w:t>Pago realizado</w:t>
@@ -6047,17 +5629,13 @@
               <w:spacing w:after="0" w:line="240" w:lineRule="auto"/>
               <w:jc w:val="center"/>
               <w:rPr>
-                <w:rFonts w:ascii="Times New Roman" w:eastAsia="Times New Roman" w:hAnsi="Times New Roman"/>
-                <w:sz w:val="24"/>
-                <w:szCs w:val="24"/>
-                <w:lang w:val="es-EC" w:eastAsia="es-EC"/>
-              </w:rPr>
-            </w:pPr>
-            <w:r>
-              <w:rPr>
-                <w:rFonts w:ascii="Times New Roman" w:eastAsia="Times New Roman" w:hAnsi="Times New Roman"/>
-                <w:sz w:val="24"/>
-                <w:szCs w:val="24"/>
+                <w:rFonts w:asciiTheme="minorHAnsi" w:eastAsia="Times New Roman" w:hAnsiTheme="minorHAnsi" w:cstheme="minorHAnsi"/>
+                <w:lang w:val="es-EC" w:eastAsia="es-EC"/>
+              </w:rPr>
+            </w:pPr>
+            <w:r>
+              <w:rPr>
+                <w:rFonts w:asciiTheme="minorHAnsi" w:eastAsia="Times New Roman" w:hAnsiTheme="minorHAnsi" w:cstheme="minorHAnsi"/>
                 <w:lang w:val="es-EC" w:eastAsia="es-EC"/>
               </w:rPr>
               <w:t>Empresa</w:t>
@@ -6074,17 +5652,13 @@
               <w:spacing w:after="0" w:line="240" w:lineRule="auto"/>
               <w:jc w:val="center"/>
               <w:rPr>
-                <w:rFonts w:ascii="Times New Roman" w:eastAsia="Times New Roman" w:hAnsi="Times New Roman"/>
-                <w:sz w:val="24"/>
-                <w:szCs w:val="24"/>
-                <w:lang w:val="es-EC" w:eastAsia="es-EC"/>
-              </w:rPr>
-            </w:pPr>
-            <w:r>
-              <w:rPr>
-                <w:rFonts w:ascii="Times New Roman" w:eastAsia="Times New Roman" w:hAnsi="Times New Roman"/>
-                <w:sz w:val="24"/>
-                <w:szCs w:val="24"/>
+                <w:rFonts w:asciiTheme="minorHAnsi" w:eastAsia="Times New Roman" w:hAnsiTheme="minorHAnsi" w:cstheme="minorHAnsi"/>
+                <w:lang w:val="es-EC" w:eastAsia="es-EC"/>
+              </w:rPr>
+            </w:pPr>
+            <w:r>
+              <w:rPr>
+                <w:rFonts w:asciiTheme="minorHAnsi" w:eastAsia="Times New Roman" w:hAnsiTheme="minorHAnsi" w:cstheme="minorHAnsi"/>
                 <w:lang w:val="es-EC" w:eastAsia="es-EC"/>
               </w:rPr>
               <w:t>Comprobante de pago</w:t>
@@ -10149,6 +9723,7 @@
   <w:style w:type="character" w:default="1" w:styleId="Fuentedeprrafopredeter">
     <w:name w:val="Default Paragraph Font"/>
     <w:uiPriority w:val="1"/>
+    <w:semiHidden/>
     <w:unhideWhenUsed/>
   </w:style>
   <w:style w:type="table" w:default="1" w:styleId="Tablanormal">

</xml_diff>